<commit_message>
Latest changes July 19 to the ZSight User Guide
</commit_message>
<xml_diff>
--- a/2026/UpdatedPolicies/DevSec_CI_CD_Hardening_Policy_v1.0[45].docx
+++ b/2026/UpdatedPolicies/DevSec_CI_CD_Hardening_Policy_v1.0[45].docx
@@ -353,7 +353,7 @@
           <w:r>
             <w:fldChar w:fldCharType="separate"/>
           </w:r>
-          <w:hyperlink w:anchor="_Toc234567706" w:history="1">
+          <w:hyperlink w:anchor="_Toc235008639" w:history="1">
             <w:r>
               <w:rPr>
                 <w:rStyle w:val="Hyperlink"/>
@@ -392,7 +392,7 @@
               <w:rPr>
                 <w:webHidden/>
               </w:rPr>
-              <w:instrText xml:space="preserve"> PAGEREF _Toc234567706 \h </w:instrText>
+              <w:instrText xml:space="preserve"> PAGEREF _Toc235008639 \h </w:instrText>
             </w:r>
             <w:r>
               <w:rPr>
@@ -433,7 +433,7 @@
               <w:szCs w:val="24"/>
             </w:rPr>
           </w:pPr>
-          <w:hyperlink w:anchor="_Toc234567707" w:history="1">
+          <w:hyperlink w:anchor="_Toc235008640" w:history="1">
             <w:r>
               <w:rPr>
                 <w:rStyle w:val="Hyperlink"/>
@@ -476,7 +476,7 @@
                 <w:noProof/>
                 <w:webHidden/>
               </w:rPr>
-              <w:instrText xml:space="preserve"> PAGEREF _Toc234567707 \h </w:instrText>
+              <w:instrText xml:space="preserve"> PAGEREF _Toc235008640 \h </w:instrText>
             </w:r>
             <w:r>
               <w:rPr>
@@ -521,7 +521,7 @@
               <w:szCs w:val="24"/>
             </w:rPr>
           </w:pPr>
-          <w:hyperlink w:anchor="_Toc234567708" w:history="1">
+          <w:hyperlink w:anchor="_Toc235008641" w:history="1">
             <w:r>
               <w:rPr>
                 <w:rStyle w:val="Hyperlink"/>
@@ -564,7 +564,7 @@
                 <w:noProof/>
                 <w:webHidden/>
               </w:rPr>
-              <w:instrText xml:space="preserve"> PAGEREF _Toc234567708 \h </w:instrText>
+              <w:instrText xml:space="preserve"> PAGEREF _Toc235008641 \h </w:instrText>
             </w:r>
             <w:r>
               <w:rPr>
@@ -609,7 +609,7 @@
               <w:szCs w:val="24"/>
             </w:rPr>
           </w:pPr>
-          <w:hyperlink w:anchor="_Toc234567709" w:history="1">
+          <w:hyperlink w:anchor="_Toc235008642" w:history="1">
             <w:r>
               <w:rPr>
                 <w:rStyle w:val="Hyperlink"/>
@@ -652,7 +652,7 @@
                 <w:noProof/>
                 <w:webHidden/>
               </w:rPr>
-              <w:instrText xml:space="preserve"> PAGEREF _Toc234567709 \h </w:instrText>
+              <w:instrText xml:space="preserve"> PAGEREF _Toc235008642 \h </w:instrText>
             </w:r>
             <w:r>
               <w:rPr>
@@ -697,7 +697,7 @@
               <w:szCs w:val="24"/>
             </w:rPr>
           </w:pPr>
-          <w:hyperlink w:anchor="_Toc234567710" w:history="1">
+          <w:hyperlink w:anchor="_Toc235008643" w:history="1">
             <w:r>
               <w:rPr>
                 <w:rStyle w:val="Hyperlink"/>
@@ -736,7 +736,7 @@
               <w:rPr>
                 <w:webHidden/>
               </w:rPr>
-              <w:instrText xml:space="preserve"> PAGEREF _Toc234567710 \h </w:instrText>
+              <w:instrText xml:space="preserve"> PAGEREF _Toc235008643 \h </w:instrText>
             </w:r>
             <w:r>
               <w:rPr>
@@ -777,7 +777,7 @@
               <w:szCs w:val="24"/>
             </w:rPr>
           </w:pPr>
-          <w:hyperlink w:anchor="_Toc234567711" w:history="1">
+          <w:hyperlink w:anchor="_Toc235008644" w:history="1">
             <w:r>
               <w:rPr>
                 <w:rStyle w:val="Hyperlink"/>
@@ -820,7 +820,7 @@
                 <w:noProof/>
                 <w:webHidden/>
               </w:rPr>
-              <w:instrText xml:space="preserve"> PAGEREF _Toc234567711 \h </w:instrText>
+              <w:instrText xml:space="preserve"> PAGEREF _Toc235008644 \h </w:instrText>
             </w:r>
             <w:r>
               <w:rPr>
@@ -865,7 +865,7 @@
               <w:szCs w:val="24"/>
             </w:rPr>
           </w:pPr>
-          <w:hyperlink w:anchor="_Toc234567712" w:history="1">
+          <w:hyperlink w:anchor="_Toc235008645" w:history="1">
             <w:r>
               <w:rPr>
                 <w:rStyle w:val="Hyperlink"/>
@@ -908,7 +908,7 @@
                 <w:noProof/>
                 <w:webHidden/>
               </w:rPr>
-              <w:instrText xml:space="preserve"> PAGEREF _Toc234567712 \h </w:instrText>
+              <w:instrText xml:space="preserve"> PAGEREF _Toc235008645 \h </w:instrText>
             </w:r>
             <w:r>
               <w:rPr>
@@ -953,7 +953,7 @@
               <w:szCs w:val="24"/>
             </w:rPr>
           </w:pPr>
-          <w:hyperlink w:anchor="_Toc234567713" w:history="1">
+          <w:hyperlink w:anchor="_Toc235008646" w:history="1">
             <w:r>
               <w:rPr>
                 <w:rStyle w:val="Hyperlink"/>
@@ -996,7 +996,7 @@
                 <w:noProof/>
                 <w:webHidden/>
               </w:rPr>
-              <w:instrText xml:space="preserve"> PAGEREF _Toc234567713 \h </w:instrText>
+              <w:instrText xml:space="preserve"> PAGEREF _Toc235008646 \h </w:instrText>
             </w:r>
             <w:r>
               <w:rPr>
@@ -1041,7 +1041,7 @@
               <w:szCs w:val="24"/>
             </w:rPr>
           </w:pPr>
-          <w:hyperlink w:anchor="_Toc234567714" w:history="1">
+          <w:hyperlink w:anchor="_Toc235008647" w:history="1">
             <w:r>
               <w:rPr>
                 <w:rStyle w:val="Hyperlink"/>
@@ -1084,7 +1084,7 @@
                 <w:noProof/>
                 <w:webHidden/>
               </w:rPr>
-              <w:instrText xml:space="preserve"> PAGEREF _Toc234567714 \h </w:instrText>
+              <w:instrText xml:space="preserve"> PAGEREF _Toc235008647 \h </w:instrText>
             </w:r>
             <w:r>
               <w:rPr>
@@ -1129,7 +1129,7 @@
               <w:szCs w:val="24"/>
             </w:rPr>
           </w:pPr>
-          <w:hyperlink w:anchor="_Toc234567715" w:history="1">
+          <w:hyperlink w:anchor="_Toc235008648" w:history="1">
             <w:r>
               <w:rPr>
                 <w:rStyle w:val="Hyperlink"/>
@@ -1172,7 +1172,7 @@
                 <w:noProof/>
                 <w:webHidden/>
               </w:rPr>
-              <w:instrText xml:space="preserve"> PAGEREF _Toc234567715 \h </w:instrText>
+              <w:instrText xml:space="preserve"> PAGEREF _Toc235008648 \h </w:instrText>
             </w:r>
             <w:r>
               <w:rPr>
@@ -1217,7 +1217,7 @@
               <w:szCs w:val="24"/>
             </w:rPr>
           </w:pPr>
-          <w:hyperlink w:anchor="_Toc234567716" w:history="1">
+          <w:hyperlink w:anchor="_Toc235008649" w:history="1">
             <w:r>
               <w:rPr>
                 <w:rStyle w:val="Hyperlink"/>
@@ -1256,7 +1256,7 @@
               <w:rPr>
                 <w:webHidden/>
               </w:rPr>
-              <w:instrText xml:space="preserve"> PAGEREF _Toc234567716 \h </w:instrText>
+              <w:instrText xml:space="preserve"> PAGEREF _Toc235008649 \h </w:instrText>
             </w:r>
             <w:r>
               <w:rPr>
@@ -1297,7 +1297,7 @@
               <w:szCs w:val="24"/>
             </w:rPr>
           </w:pPr>
-          <w:hyperlink w:anchor="_Toc234567717" w:history="1">
+          <w:hyperlink w:anchor="_Toc235008650" w:history="1">
             <w:r>
               <w:rPr>
                 <w:rStyle w:val="Hyperlink"/>
@@ -1340,7 +1340,7 @@
                 <w:noProof/>
                 <w:webHidden/>
               </w:rPr>
-              <w:instrText xml:space="preserve"> PAGEREF _Toc234567717 \h </w:instrText>
+              <w:instrText xml:space="preserve"> PAGEREF _Toc235008650 \h </w:instrText>
             </w:r>
             <w:r>
               <w:rPr>
@@ -1385,7 +1385,7 @@
               <w:szCs w:val="24"/>
             </w:rPr>
           </w:pPr>
-          <w:hyperlink w:anchor="_Toc234567718" w:history="1">
+          <w:hyperlink w:anchor="_Toc235008651" w:history="1">
             <w:r>
               <w:rPr>
                 <w:rStyle w:val="Hyperlink"/>
@@ -1428,7 +1428,7 @@
                 <w:noProof/>
                 <w:webHidden/>
               </w:rPr>
-              <w:instrText xml:space="preserve"> PAGEREF _Toc234567718 \h </w:instrText>
+              <w:instrText xml:space="preserve"> PAGEREF _Toc235008651 \h </w:instrText>
             </w:r>
             <w:r>
               <w:rPr>
@@ -1473,7 +1473,7 @@
               <w:szCs w:val="24"/>
             </w:rPr>
           </w:pPr>
-          <w:hyperlink w:anchor="_Toc234567719" w:history="1">
+          <w:hyperlink w:anchor="_Toc235008652" w:history="1">
             <w:r>
               <w:rPr>
                 <w:rStyle w:val="Hyperlink"/>
@@ -1516,7 +1516,7 @@
                 <w:noProof/>
                 <w:webHidden/>
               </w:rPr>
-              <w:instrText xml:space="preserve"> PAGEREF _Toc234567719 \h </w:instrText>
+              <w:instrText xml:space="preserve"> PAGEREF _Toc235008652 \h </w:instrText>
             </w:r>
             <w:r>
               <w:rPr>
@@ -1561,7 +1561,7 @@
               <w:szCs w:val="24"/>
             </w:rPr>
           </w:pPr>
-          <w:hyperlink w:anchor="_Toc234567720" w:history="1">
+          <w:hyperlink w:anchor="_Toc235008653" w:history="1">
             <w:r>
               <w:rPr>
                 <w:rStyle w:val="Hyperlink"/>
@@ -1604,7 +1604,7 @@
                 <w:noProof/>
                 <w:webHidden/>
               </w:rPr>
-              <w:instrText xml:space="preserve"> PAGEREF _Toc234567720 \h </w:instrText>
+              <w:instrText xml:space="preserve"> PAGEREF _Toc235008653 \h </w:instrText>
             </w:r>
             <w:r>
               <w:rPr>
@@ -1649,7 +1649,7 @@
               <w:szCs w:val="24"/>
             </w:rPr>
           </w:pPr>
-          <w:hyperlink w:anchor="_Toc234567721" w:history="1">
+          <w:hyperlink w:anchor="_Toc235008654" w:history="1">
             <w:r>
               <w:rPr>
                 <w:rStyle w:val="Hyperlink"/>
@@ -1692,7 +1692,7 @@
                 <w:noProof/>
                 <w:webHidden/>
               </w:rPr>
-              <w:instrText xml:space="preserve"> PAGEREF _Toc234567721 \h </w:instrText>
+              <w:instrText xml:space="preserve"> PAGEREF _Toc235008654 \h </w:instrText>
             </w:r>
             <w:r>
               <w:rPr>
@@ -1737,7 +1737,7 @@
               <w:szCs w:val="24"/>
             </w:rPr>
           </w:pPr>
-          <w:hyperlink w:anchor="_Toc234567722" w:history="1">
+          <w:hyperlink w:anchor="_Toc235008655" w:history="1">
             <w:r>
               <w:rPr>
                 <w:rStyle w:val="Hyperlink"/>
@@ -1776,7 +1776,7 @@
               <w:rPr>
                 <w:webHidden/>
               </w:rPr>
-              <w:instrText xml:space="preserve"> PAGEREF _Toc234567722 \h </w:instrText>
+              <w:instrText xml:space="preserve"> PAGEREF _Toc235008655 \h </w:instrText>
             </w:r>
             <w:r>
               <w:rPr>
@@ -1817,7 +1817,7 @@
               <w:szCs w:val="24"/>
             </w:rPr>
           </w:pPr>
-          <w:hyperlink w:anchor="_Toc234567723" w:history="1">
+          <w:hyperlink w:anchor="_Toc235008656" w:history="1">
             <w:r>
               <w:rPr>
                 <w:rStyle w:val="Hyperlink"/>
@@ -1856,7 +1856,7 @@
               <w:rPr>
                 <w:webHidden/>
               </w:rPr>
-              <w:instrText xml:space="preserve"> PAGEREF _Toc234567723 \h </w:instrText>
+              <w:instrText xml:space="preserve"> PAGEREF _Toc235008656 \h </w:instrText>
             </w:r>
             <w:r>
               <w:rPr>
@@ -1979,7 +1979,7 @@
       <w:pPr>
         <w:pStyle w:val="Heading1"/>
       </w:pPr>
-      <w:bookmarkStart w:id="0" w:name="_Toc234567706"/>
+      <w:bookmarkStart w:id="0" w:name="_Toc235008639"/>
       <w:r>
         <w:lastRenderedPageBreak/>
         <w:t>DOCUMENT INFORMATION</w:t>
@@ -1990,7 +1990,7 @@
       <w:pPr>
         <w:pStyle w:val="Heading2"/>
       </w:pPr>
-      <w:bookmarkStart w:id="1" w:name="_Toc234567707"/>
+      <w:bookmarkStart w:id="1" w:name="_Toc235008640"/>
       <w:r>
         <w:t>Validation</w:t>
       </w:r>
@@ -2487,7 +2487,7 @@
       <w:pPr>
         <w:pStyle w:val="Heading2"/>
       </w:pPr>
-      <w:bookmarkStart w:id="2" w:name="_Toc234567708"/>
+      <w:bookmarkStart w:id="2" w:name="_Toc235008641"/>
       <w:r>
         <w:t>Document Distribution</w:t>
       </w:r>
@@ -2685,7 +2685,7 @@
       <w:pPr>
         <w:pStyle w:val="Heading2"/>
       </w:pPr>
-      <w:bookmarkStart w:id="3" w:name="_Toc234567709"/>
+      <w:bookmarkStart w:id="3" w:name="_Toc235008642"/>
       <w:r>
         <w:t>Version Control</w:t>
       </w:r>
@@ -3077,10 +3077,14 @@
     <w:p>
       <w:pPr>
         <w:sectPr>
-          <w:headerReference w:type="default" r:id="rId9"/>
-          <w:footerReference w:type="default" r:id="rId10"/>
+          <w:headerReference w:type="even" r:id="rId9"/>
+          <w:headerReference w:type="default" r:id="rId10"/>
+          <w:footerReference w:type="even" r:id="rId11"/>
+          <w:footerReference w:type="default" r:id="rId12"/>
+          <w:headerReference w:type="first" r:id="rId13"/>
+          <w:footerReference w:type="first" r:id="rId14"/>
           <w:pgSz w:w="12240" w:h="15840"/>
-          <w:pgMar w:top="1411" w:right="850" w:bottom="1411" w:left="850" w:header="720" w:footer="720" w:gutter="0"/>
+          <w:pgMar w:top="1411" w:right="850" w:bottom="1411" w:left="850" w:header="576" w:footer="720" w:gutter="0"/>
           <w:pgNumType w:chapSep="period"/>
           <w:cols w:space="720"/>
           <w:docGrid w:linePitch="360"/>
@@ -3091,7 +3095,7 @@
       <w:pPr>
         <w:pStyle w:val="Heading1"/>
       </w:pPr>
-      <w:bookmarkStart w:id="4" w:name="_Toc234567710"/>
+      <w:bookmarkStart w:id="4" w:name="_Toc235008643"/>
       <w:r>
         <w:lastRenderedPageBreak/>
         <w:t>P</w:t>
@@ -3108,7 +3112,7 @@
       <w:pPr>
         <w:pStyle w:val="Heading2"/>
       </w:pPr>
-      <w:bookmarkStart w:id="5" w:name="_Toc234567711"/>
+      <w:bookmarkStart w:id="5" w:name="_Toc235008644"/>
       <w:r>
         <w:t>About this document</w:t>
       </w:r>
@@ -3138,7 +3142,7 @@
       <w:pPr>
         <w:pStyle w:val="Heading2"/>
       </w:pPr>
-      <w:bookmarkStart w:id="6" w:name="_Toc234567712"/>
+      <w:bookmarkStart w:id="6" w:name="_Toc235008645"/>
       <w:r>
         <w:t>Scope</w:t>
       </w:r>
@@ -3262,7 +3266,7 @@
       <w:pPr>
         <w:pStyle w:val="Heading2"/>
       </w:pPr>
-      <w:bookmarkStart w:id="7" w:name="_Toc234567713"/>
+      <w:bookmarkStart w:id="7" w:name="_Toc235008646"/>
       <w:r>
         <w:t>Roles &amp; Responsibilities</w:t>
       </w:r>
@@ -3564,7 +3568,7 @@
       <w:pPr>
         <w:pStyle w:val="Heading2"/>
       </w:pPr>
-      <w:bookmarkStart w:id="8" w:name="_Toc234567714"/>
+      <w:bookmarkStart w:id="8" w:name="_Toc235008647"/>
       <w:r>
         <w:t>Terminology</w:t>
       </w:r>
@@ -3873,7 +3877,7 @@
       <w:pPr>
         <w:pStyle w:val="Heading2"/>
       </w:pPr>
-      <w:bookmarkStart w:id="9" w:name="_Toc234567715"/>
+      <w:bookmarkStart w:id="9" w:name="_Toc235008648"/>
       <w:r>
         <w:t>Conventions Used</w:t>
       </w:r>
@@ -4126,15 +4130,10 @@
     <w:p/>
     <w:p>
       <w:pPr>
-        <w:pStyle w:val="Heading1"/>
-        <w:numPr>
-          <w:ilvl w:val="0"/>
-          <w:numId w:val="0"/>
-        </w:numPr>
         <w:sectPr>
-          <w:headerReference w:type="default" r:id="rId11"/>
+          <w:headerReference w:type="default" r:id="rId15"/>
           <w:pgSz w:w="12240" w:h="15840"/>
-          <w:pgMar w:top="1411" w:right="850" w:bottom="1411" w:left="850" w:header="720" w:footer="720" w:gutter="0"/>
+          <w:pgMar w:top="1411" w:right="850" w:bottom="1411" w:left="850" w:header="576" w:footer="720" w:gutter="0"/>
           <w:pgNumType w:chapSep="period"/>
           <w:cols w:space="720"/>
           <w:docGrid w:linePitch="360"/>
@@ -4145,7 +4144,7 @@
       <w:pPr>
         <w:pStyle w:val="Heading1"/>
       </w:pPr>
-      <w:bookmarkStart w:id="10" w:name="_Toc234567716"/>
+      <w:bookmarkStart w:id="10" w:name="_Toc235008649"/>
       <w:r>
         <w:lastRenderedPageBreak/>
         <w:t>policy requirements</w:t>
@@ -4162,7 +4161,7 @@
       <w:pPr>
         <w:pStyle w:val="Heading2"/>
       </w:pPr>
-      <w:bookmarkStart w:id="11" w:name="_Toc234567717"/>
+      <w:bookmarkStart w:id="11" w:name="_Toc235008650"/>
       <w:r>
         <w:t>Access Control</w:t>
       </w:r>
@@ -4327,7 +4326,7 @@
       <w:pPr>
         <w:pStyle w:val="Heading2"/>
       </w:pPr>
-      <w:bookmarkStart w:id="12" w:name="_Toc234567718"/>
+      <w:bookmarkStart w:id="12" w:name="_Toc235008651"/>
       <w:r>
         <w:t>Secret Management</w:t>
       </w:r>
@@ -4423,7 +4422,7 @@
       <w:pPr>
         <w:pStyle w:val="Heading2"/>
       </w:pPr>
-      <w:bookmarkStart w:id="13" w:name="_Toc234567719"/>
+      <w:bookmarkStart w:id="13" w:name="_Toc235008652"/>
       <w:r>
         <w:t>P</w:t>
       </w:r>
@@ -4509,7 +4508,7 @@
       <w:pPr>
         <w:pStyle w:val="Heading2"/>
       </w:pPr>
-      <w:bookmarkStart w:id="14" w:name="_Toc234567720"/>
+      <w:bookmarkStart w:id="14" w:name="_Toc235008653"/>
       <w:r>
         <w:t>GitHub Actions/Third-Party Pipelines</w:t>
       </w:r>
@@ -4614,7 +4613,7 @@
       <w:pPr>
         <w:pStyle w:val="Heading2"/>
       </w:pPr>
-      <w:bookmarkStart w:id="15" w:name="_Toc234567721"/>
+      <w:bookmarkStart w:id="15" w:name="_Toc235008654"/>
       <w:r>
         <w:t>Logs &amp; Monitoring</w:t>
       </w:r>
@@ -4673,11 +4672,10 @@
     </w:p>
     <w:p>
       <w:pPr>
-        <w:pStyle w:val="Heading1"/>
         <w:sectPr>
-          <w:headerReference w:type="default" r:id="rId12"/>
+          <w:headerReference w:type="default" r:id="rId16"/>
           <w:pgSz w:w="12240" w:h="15840"/>
-          <w:pgMar w:top="1411" w:right="850" w:bottom="1411" w:left="850" w:header="720" w:footer="720" w:gutter="0"/>
+          <w:pgMar w:top="1411" w:right="850" w:bottom="1411" w:left="850" w:header="576" w:footer="720" w:gutter="0"/>
           <w:pgNumType w:chapSep="period"/>
           <w:cols w:space="720"/>
           <w:docGrid w:linePitch="360"/>
@@ -4688,7 +4686,7 @@
       <w:pPr>
         <w:pStyle w:val="Heading1"/>
       </w:pPr>
-      <w:bookmarkStart w:id="16" w:name="_Toc234567722"/>
+      <w:bookmarkStart w:id="16" w:name="_Toc235008655"/>
       <w:r>
         <w:lastRenderedPageBreak/>
         <w:t>Violations</w:t>
@@ -4698,9 +4696,9 @@
     <w:p>
       <w:pPr>
         <w:sectPr>
-          <w:headerReference w:type="default" r:id="rId13"/>
+          <w:headerReference w:type="default" r:id="rId17"/>
           <w:pgSz w:w="12240" w:h="15840"/>
-          <w:pgMar w:top="1411" w:right="850" w:bottom="1411" w:left="850" w:header="720" w:footer="720" w:gutter="0"/>
+          <w:pgMar w:top="1411" w:right="850" w:bottom="1411" w:left="850" w:header="576" w:footer="720" w:gutter="0"/>
           <w:pgNumType w:chapSep="period"/>
           <w:cols w:space="720"/>
           <w:docGrid w:linePitch="360"/>
@@ -4714,7 +4712,7 @@
       <w:pPr>
         <w:pStyle w:val="Heading1"/>
       </w:pPr>
-      <w:bookmarkStart w:id="17" w:name="_Toc234567723"/>
+      <w:bookmarkStart w:id="17" w:name="_Toc235008656"/>
       <w:r>
         <w:lastRenderedPageBreak/>
         <w:t xml:space="preserve">POLICY </w:t>
@@ -5247,9 +5245,9 @@
     </w:tbl>
     <w:p/>
     <w:sectPr>
-      <w:headerReference w:type="default" r:id="rId14"/>
+      <w:headerReference w:type="default" r:id="rId18"/>
       <w:pgSz w:w="12240" w:h="15840"/>
-      <w:pgMar w:top="1411" w:right="850" w:bottom="1411" w:left="850" w:header="720" w:footer="720" w:gutter="0"/>
+      <w:pgMar w:top="1411" w:right="850" w:bottom="1411" w:left="850" w:header="576" w:footer="720" w:gutter="0"/>
       <w:pgNumType w:chapSep="period"/>
       <w:cols w:space="720"/>
       <w:docGrid w:linePitch="360"/>
@@ -5284,6 +5282,16 @@
 </file>
 
 <file path=word/footer1.xml><?xml version="1.0" encoding="utf-8"?>
+<w:ftr xmlns:wpc="http://schemas.microsoft.com/office/word/2010/wordprocessingCanvas" xmlns:cx="http://schemas.microsoft.com/office/drawing/2014/chartex" xmlns:cx1="http://schemas.microsoft.com/office/drawing/2015/9/8/chartex" xmlns:cx2="http://schemas.microsoft.com/office/drawing/2015/10/21/chartex" xmlns:cx3="http://schemas.microsoft.com/office/drawing/2016/5/9/chartex" xmlns:cx4="http://schemas.microsoft.com/office/drawing/2016/5/10/chartex" xmlns:cx5="http://schemas.microsoft.com/office/drawing/2016/5/11/chartex" xmlns:cx6="http://schemas.microsoft.com/office/drawing/2016/5/12/chartex" xmlns:cx7="http://schemas.microsoft.com/office/drawing/2016/5/13/chartex" xmlns:cx8="http://schemas.microsoft.com/office/drawing/2016/5/14/chartex" xmlns:mc="http://schemas.openxmlformats.org/markup-compatibility/2006" xmlns:aink="http://schemas.microsoft.com/office/drawing/2016/ink" xmlns:am3d="http://schemas.microsoft.com/office/drawing/2017/model3d" xmlns:o="urn:schemas-microsoft-com:office:office" xmlns:oel="http://schemas.microsoft.com/office/2019/extlst" xmlns:r="http://schemas.openxmlformats.org/officeDocument/2006/relationships" xmlns:m="http://schemas.openxmlformats.org/officeDocument/2006/math" xmlns:v="urn:schemas-microsoft-com:vml" xmlns:wp14="http://schemas.microsoft.com/office/word/2010/wordprocessingDrawing" xmlns:wp="http://schemas.openxmlformats.org/drawingml/2006/wordprocessingDrawing" xmlns:w10="urn:schemas-microsoft-com:office:word" xmlns:w="http://schemas.openxmlformats.org/wordprocessingml/2006/main" xmlns:w14="http://schemas.microsoft.com/office/word/2010/wordml" xmlns:w15="http://schemas.microsoft.com/office/word/2012/wordml" xmlns:w16cex="http://schemas.microsoft.com/office/word/2018/wordml/cex" xmlns:w16cid="http://schemas.microsoft.com/office/word/2016/wordml/cid" xmlns:w16="http://schemas.microsoft.com/office/word/2018/wordml" xmlns:w16du="http://schemas.microsoft.com/office/word/2023/wordml/word16du" xmlns:w16sdtdh="http://schemas.microsoft.com/office/word/2020/wordml/sdtdatahash" xmlns:w16sdtfl="http://schemas.microsoft.com/office/word/2024/wordml/sdtformatlock" xmlns:w16se="http://schemas.microsoft.com/office/word/2015/wordml/symex" xmlns:wpg="http://schemas.microsoft.com/office/word/2010/wordprocessingGroup" xmlns:wpi="http://schemas.microsoft.com/office/word/2010/wordprocessingInk" xmlns:wne="http://schemas.microsoft.com/office/word/2006/wordml" xmlns:wps="http://schemas.microsoft.com/office/word/2010/wordprocessingShape" mc:Ignorable="w14 w15 w16se w16cid w16 w16cex w16sdtdh w16sdtfl w16du wp14">
+  <w:p>
+    <w:pPr>
+      <w:pStyle w:val="Footer"/>
+    </w:pPr>
+  </w:p>
+</w:ftr>
+</file>
+
+<file path=word/footer2.xml><?xml version="1.0" encoding="utf-8"?>
 <w:ftr xmlns:wpc="http://schemas.microsoft.com/office/word/2010/wordprocessingCanvas" xmlns:cx="http://schemas.microsoft.com/office/drawing/2014/chartex" xmlns:cx1="http://schemas.microsoft.com/office/drawing/2015/9/8/chartex" xmlns:cx2="http://schemas.microsoft.com/office/drawing/2015/10/21/chartex" xmlns:cx3="http://schemas.microsoft.com/office/drawing/2016/5/9/chartex" xmlns:cx4="http://schemas.microsoft.com/office/drawing/2016/5/10/chartex" xmlns:cx5="http://schemas.microsoft.com/office/drawing/2016/5/11/chartex" xmlns:cx6="http://schemas.microsoft.com/office/drawing/2016/5/12/chartex" xmlns:cx7="http://schemas.microsoft.com/office/drawing/2016/5/13/chartex" xmlns:cx8="http://schemas.microsoft.com/office/drawing/2016/5/14/chartex" xmlns:mc="http://schemas.openxmlformats.org/markup-compatibility/2006" xmlns:aink="http://schemas.microsoft.com/office/drawing/2016/ink" xmlns:am3d="http://schemas.microsoft.com/office/drawing/2017/model3d" xmlns:o="urn:schemas-microsoft-com:office:office" xmlns:oel="http://schemas.microsoft.com/office/2019/extlst" xmlns:r="http://schemas.openxmlformats.org/officeDocument/2006/relationships" xmlns:m="http://schemas.openxmlformats.org/officeDocument/2006/math" xmlns:v="urn:schemas-microsoft-com:vml" xmlns:wp14="http://schemas.microsoft.com/office/word/2010/wordprocessingDrawing" xmlns:wp="http://schemas.openxmlformats.org/drawingml/2006/wordprocessingDrawing" xmlns:w10="urn:schemas-microsoft-com:office:word" xmlns:w="http://schemas.openxmlformats.org/wordprocessingml/2006/main" xmlns:w14="http://schemas.microsoft.com/office/word/2010/wordml" xmlns:w15="http://schemas.microsoft.com/office/word/2012/wordml" xmlns:w16cex="http://schemas.microsoft.com/office/word/2018/wordml/cex" xmlns:w16cid="http://schemas.microsoft.com/office/word/2016/wordml/cid" xmlns:w16="http://schemas.microsoft.com/office/word/2018/wordml" xmlns:w16du="http://schemas.microsoft.com/office/word/2023/wordml/word16du" xmlns:w16sdtdh="http://schemas.microsoft.com/office/word/2020/wordml/sdtdatahash" xmlns:w16sdtfl="http://schemas.microsoft.com/office/word/2024/wordml/sdtformatlock" xmlns:w16se="http://schemas.microsoft.com/office/word/2015/wordml/symex" xmlns:wpg="http://schemas.microsoft.com/office/word/2010/wordprocessingGroup" xmlns:wpi="http://schemas.microsoft.com/office/word/2010/wordprocessingInk" xmlns:wne="http://schemas.microsoft.com/office/word/2006/wordml" xmlns:wps="http://schemas.microsoft.com/office/word/2010/wordprocessingShape" mc:Ignorable="w14 w15 w16se w16cid w16 w16cex w16sdtdh w16sdtfl w16du wp14">
   <w:sdt>
     <w:sdtPr>
@@ -5297,200 +5305,361 @@
       <w:rPr>
         <w:noProof/>
         <w:color w:val="4F7ABA"/>
-        <w:sz w:val="16"/>
-        <w:szCs w:val="16"/>
+        <w:sz w:val="6"/>
+        <w:szCs w:val="6"/>
       </w:rPr>
     </w:sdtEndPr>
     <w:sdtContent>
       <w:p>
         <w:pPr>
           <w:pStyle w:val="Footer"/>
-          <w:jc w:val="right"/>
-          <w:rPr>
-            <w:color w:val="4F7ABA"/>
-            <w:sz w:val="16"/>
-            <w:szCs w:val="16"/>
-          </w:rPr>
-        </w:pPr>
-        <w:r>
-          <w:rPr>
-            <w:color w:val="4F7ABA"/>
-            <w:sz w:val="16"/>
-            <w:szCs w:val="16"/>
-          </w:rPr>
-          <w:fldChar w:fldCharType="begin"/>
-        </w:r>
-        <w:r>
-          <w:rPr>
-            <w:color w:val="4F7ABA"/>
-            <w:sz w:val="16"/>
-            <w:szCs w:val="16"/>
-          </w:rPr>
-          <w:instrText xml:space="preserve"> PAGE   \* MERGEFORMAT </w:instrText>
-        </w:r>
-        <w:r>
-          <w:rPr>
-            <w:color w:val="4F7ABA"/>
-            <w:sz w:val="16"/>
-            <w:szCs w:val="16"/>
-          </w:rPr>
-          <w:fldChar w:fldCharType="separate"/>
-        </w:r>
-        <w:r>
+          <w:jc w:val="center"/>
           <w:rPr>
             <w:noProof/>
             <w:color w:val="4F7ABA"/>
             <w:sz w:val="16"/>
             <w:szCs w:val="16"/>
           </w:rPr>
-          <w:t>2</w:t>
-        </w:r>
-        <w:r>
+        </w:pPr>
+      </w:p>
+      <w:tbl>
+        <w:tblPr>
+          <w:tblStyle w:val="TableGrid"/>
+          <w:tblW w:w="5000" w:type="pct"/>
+          <w:jc w:val="center"/>
+          <w:tblBorders>
+            <w:top w:val="none" w:sz="0" w:space="0" w:color="auto"/>
+            <w:left w:val="none" w:sz="0" w:space="0" w:color="auto"/>
+            <w:bottom w:val="none" w:sz="0" w:space="0" w:color="auto"/>
+            <w:right w:val="none" w:sz="0" w:space="0" w:color="auto"/>
+            <w:insideH w:val="none" w:sz="0" w:space="0" w:color="auto"/>
+            <w:insideV w:val="none" w:sz="0" w:space="0" w:color="auto"/>
+          </w:tblBorders>
+          <w:tblLook w:val="04A0" w:firstRow="1" w:lastRow="0" w:firstColumn="1" w:lastColumn="0" w:noHBand="0" w:noVBand="1"/>
+        </w:tblPr>
+        <w:tblGrid>
+          <w:gridCol w:w="2225"/>
+          <w:gridCol w:w="2226"/>
+          <w:gridCol w:w="2226"/>
+          <w:gridCol w:w="1810"/>
+          <w:gridCol w:w="946"/>
+          <w:gridCol w:w="222"/>
+          <w:gridCol w:w="222"/>
+          <w:gridCol w:w="358"/>
+          <w:gridCol w:w="305"/>
+        </w:tblGrid>
+        <w:tr>
+          <w:trPr>
+            <w:cantSplit/>
+            <w:trHeight w:val="170"/>
+            <w:jc w:val="center"/>
+          </w:trPr>
+          <w:tc>
+            <w:tcPr>
+              <w:tcW w:w="4866" w:type="pct"/>
+              <w:gridSpan w:val="8"/>
+            </w:tcPr>
+            <w:p>
+              <w:pPr>
+                <w:jc w:val="center"/>
+                <w:rPr>
+                  <w:sz w:val="12"/>
+                  <w:szCs w:val="12"/>
+                </w:rPr>
+              </w:pPr>
+              <w:r>
+                <w:rPr>
+                  <w:sz w:val="12"/>
+                  <w:szCs w:val="12"/>
+                </w:rPr>
+                <w:t xml:space="preserve">© </w:t>
+              </w:r>
+              <w:r>
+                <w:rPr>
+                  <w:bCs/>
+                  <w:sz w:val="12"/>
+                  <w:szCs w:val="12"/>
+                </w:rPr>
+                <w:t>202</w:t>
+              </w:r>
+              <w:r>
+                <w:rPr>
+                  <w:bCs/>
+                  <w:sz w:val="12"/>
+                  <w:szCs w:val="12"/>
+                </w:rPr>
+                <w:t>6</w:t>
+              </w:r>
+              <w:r>
+                <w:rPr>
+                  <w:bCs/>
+                  <w:sz w:val="12"/>
+                  <w:szCs w:val="12"/>
+                </w:rPr>
+                <w:t xml:space="preserve"> </w:t>
+              </w:r>
+              <w:proofErr w:type="spellStart"/>
+              <w:r>
+                <w:rPr>
+                  <w:sz w:val="12"/>
+                  <w:szCs w:val="12"/>
+                </w:rPr>
+                <w:t>ZTERS</w:t>
+              </w:r>
+              <w:proofErr w:type="spellEnd"/>
+              <w:r>
+                <w:rPr>
+                  <w:sz w:val="12"/>
+                  <w:szCs w:val="12"/>
+                </w:rPr>
+                <w:t xml:space="preserve"> All rights reserved</w:t>
+              </w:r>
+            </w:p>
+            <w:p>
+              <w:pPr>
+                <w:jc w:val="center"/>
+                <w:rPr>
+                  <w:sz w:val="12"/>
+                  <w:szCs w:val="12"/>
+                </w:rPr>
+              </w:pPr>
+            </w:p>
+          </w:tc>
+          <w:tc>
+            <w:tcPr>
+              <w:tcW w:w="134" w:type="pct"/>
+              <w:vMerge w:val="restart"/>
+            </w:tcPr>
+            <w:p>
+              <w:pPr>
+                <w:rPr>
+                  <w:b/>
+                  <w:bCs/>
+                  <w:color w:val="4F81BD"/>
+                  <w:sz w:val="12"/>
+                  <w:szCs w:val="12"/>
+                </w:rPr>
+              </w:pPr>
+              <w:r>
+                <w:rPr>
+                  <w:b/>
+                  <w:bCs/>
+                  <w:color w:val="4F81BD"/>
+                  <w:sz w:val="16"/>
+                  <w:szCs w:val="16"/>
+                </w:rPr>
+                <w:fldChar w:fldCharType="begin"/>
+              </w:r>
+              <w:r>
+                <w:rPr>
+                  <w:b/>
+                  <w:bCs/>
+                  <w:color w:val="4F81BD"/>
+                  <w:sz w:val="16"/>
+                  <w:szCs w:val="16"/>
+                </w:rPr>
+                <w:instrText xml:space="preserve"> PAGE   \* MERGEFORMAT </w:instrText>
+              </w:r>
+              <w:r>
+                <w:rPr>
+                  <w:b/>
+                  <w:bCs/>
+                  <w:color w:val="4F81BD"/>
+                  <w:sz w:val="16"/>
+                  <w:szCs w:val="16"/>
+                </w:rPr>
+                <w:fldChar w:fldCharType="separate"/>
+              </w:r>
+              <w:r>
+                <w:rPr>
+                  <w:b/>
+                  <w:bCs/>
+                  <w:noProof/>
+                  <w:color w:val="4F81BD"/>
+                  <w:sz w:val="16"/>
+                  <w:szCs w:val="16"/>
+                </w:rPr>
+                <w:t>1</w:t>
+              </w:r>
+              <w:r>
+                <w:rPr>
+                  <w:b/>
+                  <w:bCs/>
+                  <w:noProof/>
+                  <w:color w:val="4F81BD"/>
+                  <w:sz w:val="16"/>
+                  <w:szCs w:val="16"/>
+                </w:rPr>
+                <w:fldChar w:fldCharType="end"/>
+              </w:r>
+            </w:p>
+          </w:tc>
+        </w:tr>
+        <w:tr>
+          <w:trPr>
+            <w:cantSplit/>
+            <w:trHeight w:hRule="exact" w:val="115"/>
+            <w:jc w:val="center"/>
+          </w:trPr>
+          <w:tc>
+            <w:tcPr>
+              <w:tcW w:w="1080" w:type="pct"/>
+              <w:shd w:val="clear" w:color="auto" w:fill="E3983F"/>
+            </w:tcPr>
+            <w:p>
+              <w:pPr>
+                <w:jc w:val="center"/>
+                <w:rPr>
+                  <w:sz w:val="6"/>
+                  <w:szCs w:val="6"/>
+                </w:rPr>
+              </w:pPr>
+            </w:p>
+          </w:tc>
+          <w:tc>
+            <w:tcPr>
+              <w:tcW w:w="1080" w:type="pct"/>
+              <w:shd w:val="clear" w:color="auto" w:fill="66686C"/>
+            </w:tcPr>
+            <w:p>
+              <w:pPr>
+                <w:jc w:val="center"/>
+                <w:rPr>
+                  <w:sz w:val="6"/>
+                  <w:szCs w:val="6"/>
+                </w:rPr>
+              </w:pPr>
+            </w:p>
+          </w:tc>
+          <w:tc>
+            <w:tcPr>
+              <w:tcW w:w="1080" w:type="pct"/>
+              <w:shd w:val="clear" w:color="auto" w:fill="4F7ABA"/>
+            </w:tcPr>
+            <w:p>
+              <w:pPr>
+                <w:jc w:val="center"/>
+                <w:rPr>
+                  <w:sz w:val="6"/>
+                  <w:szCs w:val="6"/>
+                </w:rPr>
+              </w:pPr>
+            </w:p>
+          </w:tc>
+          <w:tc>
+            <w:tcPr>
+              <w:tcW w:w="883" w:type="pct"/>
+              <w:shd w:val="clear" w:color="auto" w:fill="4B327A"/>
+            </w:tcPr>
+            <w:p>
+              <w:pPr>
+                <w:jc w:val="center"/>
+                <w:rPr>
+                  <w:sz w:val="6"/>
+                  <w:szCs w:val="6"/>
+                </w:rPr>
+              </w:pPr>
+            </w:p>
+          </w:tc>
+          <w:tc>
+            <w:tcPr>
+              <w:tcW w:w="473" w:type="pct"/>
+              <w:shd w:val="clear" w:color="auto" w:fill="9ABF55"/>
+            </w:tcPr>
+            <w:p>
+              <w:pPr>
+                <w:jc w:val="center"/>
+                <w:rPr>
+                  <w:sz w:val="6"/>
+                  <w:szCs w:val="6"/>
+                </w:rPr>
+              </w:pPr>
+            </w:p>
+          </w:tc>
+          <w:tc>
+            <w:tcPr>
+              <w:tcW w:w="105" w:type="pct"/>
+              <w:shd w:val="clear" w:color="auto" w:fill="DA7238"/>
+            </w:tcPr>
+            <w:p>
+              <w:pPr>
+                <w:jc w:val="center"/>
+                <w:rPr>
+                  <w:sz w:val="6"/>
+                  <w:szCs w:val="6"/>
+                </w:rPr>
+              </w:pPr>
+            </w:p>
+          </w:tc>
+          <w:tc>
+            <w:tcPr>
+              <w:tcW w:w="105" w:type="pct"/>
+              <w:shd w:val="clear" w:color="auto" w:fill="B3D9E6"/>
+            </w:tcPr>
+            <w:p>
+              <w:pPr>
+                <w:jc w:val="center"/>
+                <w:rPr>
+                  <w:sz w:val="6"/>
+                  <w:szCs w:val="6"/>
+                </w:rPr>
+              </w:pPr>
+            </w:p>
+          </w:tc>
+          <w:tc>
+            <w:tcPr>
+              <w:tcW w:w="723" w:type="pct"/>
+              <w:shd w:val="clear" w:color="auto" w:fill="D2D3D4"/>
+            </w:tcPr>
+            <w:p>
+              <w:pPr>
+                <w:jc w:val="center"/>
+                <w:rPr>
+                  <w:sz w:val="6"/>
+                  <w:szCs w:val="6"/>
+                </w:rPr>
+              </w:pPr>
+            </w:p>
+          </w:tc>
+          <w:tc>
+            <w:tcPr>
+              <w:tcW w:w="134" w:type="pct"/>
+              <w:vMerge/>
+              <w:shd w:val="clear" w:color="auto" w:fill="D9D9D9" w:themeFill="background1" w:themeFillShade="D9"/>
+            </w:tcPr>
+            <w:p>
+              <w:pPr>
+                <w:jc w:val="center"/>
+                <w:rPr>
+                  <w:sz w:val="6"/>
+                  <w:szCs w:val="6"/>
+                </w:rPr>
+              </w:pPr>
+            </w:p>
+          </w:tc>
+        </w:tr>
+      </w:tbl>
+      <w:p>
+        <w:pPr>
+          <w:pStyle w:val="Footer"/>
           <w:rPr>
-            <w:noProof/>
             <w:color w:val="4F7ABA"/>
-            <w:sz w:val="16"/>
-            <w:szCs w:val="16"/>
+            <w:sz w:val="6"/>
+            <w:szCs w:val="6"/>
           </w:rPr>
-          <w:fldChar w:fldCharType="end"/>
-        </w:r>
+        </w:pPr>
       </w:p>
     </w:sdtContent>
   </w:sdt>
+</w:ftr>
+</file>
+
+<file path=word/footer3.xml><?xml version="1.0" encoding="utf-8"?>
+<w:ftr xmlns:wpc="http://schemas.microsoft.com/office/word/2010/wordprocessingCanvas" xmlns:cx="http://schemas.microsoft.com/office/drawing/2014/chartex" xmlns:cx1="http://schemas.microsoft.com/office/drawing/2015/9/8/chartex" xmlns:cx2="http://schemas.microsoft.com/office/drawing/2015/10/21/chartex" xmlns:cx3="http://schemas.microsoft.com/office/drawing/2016/5/9/chartex" xmlns:cx4="http://schemas.microsoft.com/office/drawing/2016/5/10/chartex" xmlns:cx5="http://schemas.microsoft.com/office/drawing/2016/5/11/chartex" xmlns:cx6="http://schemas.microsoft.com/office/drawing/2016/5/12/chartex" xmlns:cx7="http://schemas.microsoft.com/office/drawing/2016/5/13/chartex" xmlns:cx8="http://schemas.microsoft.com/office/drawing/2016/5/14/chartex" xmlns:mc="http://schemas.openxmlformats.org/markup-compatibility/2006" xmlns:aink="http://schemas.microsoft.com/office/drawing/2016/ink" xmlns:am3d="http://schemas.microsoft.com/office/drawing/2017/model3d" xmlns:o="urn:schemas-microsoft-com:office:office" xmlns:oel="http://schemas.microsoft.com/office/2019/extlst" xmlns:r="http://schemas.openxmlformats.org/officeDocument/2006/relationships" xmlns:m="http://schemas.openxmlformats.org/officeDocument/2006/math" xmlns:v="urn:schemas-microsoft-com:vml" xmlns:wp14="http://schemas.microsoft.com/office/word/2010/wordprocessingDrawing" xmlns:wp="http://schemas.openxmlformats.org/drawingml/2006/wordprocessingDrawing" xmlns:w10="urn:schemas-microsoft-com:office:word" xmlns:w="http://schemas.openxmlformats.org/wordprocessingml/2006/main" xmlns:w14="http://schemas.microsoft.com/office/word/2010/wordml" xmlns:w15="http://schemas.microsoft.com/office/word/2012/wordml" xmlns:w16cex="http://schemas.microsoft.com/office/word/2018/wordml/cex" xmlns:w16cid="http://schemas.microsoft.com/office/word/2016/wordml/cid" xmlns:w16="http://schemas.microsoft.com/office/word/2018/wordml" xmlns:w16du="http://schemas.microsoft.com/office/word/2023/wordml/word16du" xmlns:w16sdtdh="http://schemas.microsoft.com/office/word/2020/wordml/sdtdatahash" xmlns:w16sdtfl="http://schemas.microsoft.com/office/word/2024/wordml/sdtformatlock" xmlns:w16se="http://schemas.microsoft.com/office/word/2015/wordml/symex" xmlns:wpg="http://schemas.microsoft.com/office/word/2010/wordprocessingGroup" xmlns:wpi="http://schemas.microsoft.com/office/word/2010/wordprocessingInk" xmlns:wne="http://schemas.microsoft.com/office/word/2006/wordml" xmlns:wps="http://schemas.microsoft.com/office/word/2010/wordprocessingShape" mc:Ignorable="w14 w15 w16se w16cid w16 w16cex w16sdtdh w16sdtfl w16du wp14">
   <w:p>
     <w:pPr>
-      <w:spacing w:after="0"/>
-      <w:jc w:val="center"/>
-      <w:rPr>
-        <w:sz w:val="12"/>
-        <w:szCs w:val="12"/>
-      </w:rPr>
+      <w:pStyle w:val="Footer"/>
     </w:pPr>
-    <w:r>
-      <w:rPr>
-        <w:sz w:val="12"/>
-        <w:szCs w:val="12"/>
-      </w:rPr>
-      <w:t xml:space="preserve">© </w:t>
-    </w:r>
-    <w:r>
-      <w:rPr>
-        <w:bCs/>
-        <w:sz w:val="12"/>
-        <w:szCs w:val="12"/>
-      </w:rPr>
-      <w:t>202</w:t>
-    </w:r>
-    <w:r>
-      <w:rPr>
-        <w:bCs/>
-        <w:sz w:val="12"/>
-        <w:szCs w:val="12"/>
-      </w:rPr>
-      <w:t>6</w:t>
-    </w:r>
-    <w:r>
-      <w:rPr>
-        <w:bCs/>
-        <w:sz w:val="12"/>
-        <w:szCs w:val="12"/>
-      </w:rPr>
-      <w:t xml:space="preserve"> </w:t>
-    </w:r>
-    <w:r>
-      <w:rPr>
-        <w:sz w:val="12"/>
-        <w:szCs w:val="12"/>
-      </w:rPr>
-      <w:t>ZTERS</w:t>
-    </w:r>
-    <w:r>
-      <w:rPr>
-        <w:sz w:val="12"/>
-        <w:szCs w:val="12"/>
-      </w:rPr>
-      <w:t xml:space="preserve"> All rights reserved</w:t>
-    </w:r>
-  </w:p>
-  <w:p>
-    <w:pPr>
-      <w:spacing w:after="0"/>
-      <w:jc w:val="center"/>
-      <w:rPr>
-        <w:sz w:val="6"/>
-        <w:szCs w:val="6"/>
-      </w:rPr>
-    </w:pPr>
-    <w:r>
-      <w:rPr>
-        <w:noProof/>
-        <w:sz w:val="12"/>
-        <w:szCs w:val="12"/>
-      </w:rPr>
-      <w:drawing>
-        <wp:anchor distT="0" distB="0" distL="114300" distR="114300" simplePos="0" relativeHeight="251659264" behindDoc="1" locked="0" layoutInCell="1" allowOverlap="1" wp14:anchorId="0BC4D086" wp14:editId="18806678">
-          <wp:simplePos x="0" y="0"/>
-          <wp:positionH relativeFrom="margin">
-            <wp:align>center</wp:align>
-          </wp:positionH>
-          <wp:positionV relativeFrom="paragraph">
-            <wp:posOffset>100965</wp:posOffset>
-          </wp:positionV>
-          <wp:extent cx="4974336" cy="73152"/>
-          <wp:effectExtent l="0" t="0" r="0" b="3175"/>
-          <wp:wrapThrough wrapText="bothSides">
-            <wp:wrapPolygon edited="0">
-              <wp:start x="0" y="0"/>
-              <wp:lineTo x="0" y="16904"/>
-              <wp:lineTo x="21509" y="16904"/>
-              <wp:lineTo x="21509" y="0"/>
-              <wp:lineTo x="0" y="0"/>
-            </wp:wrapPolygon>
-          </wp:wrapThrough>
-          <wp:docPr id="421877979" name="Picture 1"/>
-          <wp:cNvGraphicFramePr>
-            <a:graphicFrameLocks xmlns:a="http://schemas.openxmlformats.org/drawingml/2006/main" noChangeAspect="1"/>
-          </wp:cNvGraphicFramePr>
-          <a:graphic xmlns:a="http://schemas.openxmlformats.org/drawingml/2006/main">
-            <a:graphicData uri="http://schemas.openxmlformats.org/drawingml/2006/picture">
-              <pic:pic xmlns:pic="http://schemas.openxmlformats.org/drawingml/2006/picture">
-                <pic:nvPicPr>
-                  <pic:cNvPr id="1663663410" name=""/>
-                  <pic:cNvPicPr/>
-                </pic:nvPicPr>
-                <pic:blipFill>
-                  <a:blip r:embed="rId1">
-                    <a:extLst>
-                      <a:ext uri="{28A0092B-C50C-407E-A947-70E740481C1C}">
-                        <a14:useLocalDpi xmlns:a14="http://schemas.microsoft.com/office/drawing/2010/main" val="0"/>
-                      </a:ext>
-                    </a:extLst>
-                  </a:blip>
-                  <a:stretch>
-                    <a:fillRect/>
-                  </a:stretch>
-                </pic:blipFill>
-                <pic:spPr>
-                  <a:xfrm>
-                    <a:off x="0" y="0"/>
-                    <a:ext cx="4974336" cy="73152"/>
-                  </a:xfrm>
-                  <a:prstGeom prst="rect">
-                    <a:avLst/>
-                  </a:prstGeom>
-                </pic:spPr>
-              </pic:pic>
-            </a:graphicData>
-          </a:graphic>
-          <wp14:sizeRelH relativeFrom="margin">
-            <wp14:pctWidth>0</wp14:pctWidth>
-          </wp14:sizeRelH>
-          <wp14:sizeRelV relativeFrom="margin">
-            <wp14:pctHeight>0</wp14:pctHeight>
-          </wp14:sizeRelV>
-        </wp:anchor>
-      </w:drawing>
-    </w:r>
   </w:p>
 </w:ftr>
 </file>
@@ -5525,89 +5694,125 @@
   <w:p>
     <w:pPr>
       <w:pStyle w:val="Header"/>
-      <w:rPr>
-        <w:sz w:val="16"/>
-        <w:szCs w:val="16"/>
-      </w:rPr>
     </w:pPr>
-    <w:r>
-      <w:rPr>
-        <w:noProof/>
-        <w:sz w:val="16"/>
-        <w:szCs w:val="16"/>
-      </w:rPr>
-      <w:drawing>
-        <wp:anchor distT="0" distB="0" distL="114300" distR="114300" simplePos="0" relativeHeight="251658240" behindDoc="0" locked="0" layoutInCell="1" allowOverlap="1" wp14:anchorId="721155DB" wp14:editId="4A9C6649">
-          <wp:simplePos x="0" y="0"/>
-          <wp:positionH relativeFrom="margin">
-            <wp:align>right</wp:align>
-          </wp:positionH>
-          <wp:positionV relativeFrom="paragraph">
-            <wp:posOffset>-19685</wp:posOffset>
-          </wp:positionV>
-          <wp:extent cx="326004" cy="378092"/>
-          <wp:effectExtent l="0" t="0" r="0" b="3175"/>
-          <wp:wrapThrough wrapText="bothSides">
-            <wp:wrapPolygon edited="0">
-              <wp:start x="21600" y="21600"/>
-              <wp:lineTo x="21600" y="908"/>
-              <wp:lineTo x="1389" y="908"/>
-              <wp:lineTo x="1389" y="18333"/>
-              <wp:lineTo x="2653" y="21600"/>
-              <wp:lineTo x="21600" y="21600"/>
-            </wp:wrapPolygon>
-          </wp:wrapThrough>
-          <wp:docPr id="1234658135" name="Picture 1" descr="The Site Savvy Blog - News, trends, tips, and environmental knowledge."/>
-          <wp:cNvGraphicFramePr>
-            <a:graphicFrameLocks xmlns:a="http://schemas.openxmlformats.org/drawingml/2006/main" noChangeAspect="1"/>
-          </wp:cNvGraphicFramePr>
-          <a:graphic xmlns:a="http://schemas.openxmlformats.org/drawingml/2006/main">
-            <a:graphicData uri="http://schemas.openxmlformats.org/drawingml/2006/picture">
-              <pic:pic xmlns:pic="http://schemas.openxmlformats.org/drawingml/2006/picture">
-                <pic:nvPicPr>
-                  <pic:cNvPr id="0" name="Picture 1" descr="The Site Savvy Blog - News, trends, tips, and environmental knowledge."/>
-                  <pic:cNvPicPr>
-                    <a:picLocks noChangeAspect="1" noChangeArrowheads="1"/>
-                  </pic:cNvPicPr>
-                </pic:nvPicPr>
-                <pic:blipFill>
-                  <a:blip r:embed="rId1">
-                    <a:extLst>
-                      <a:ext uri="{28A0092B-C50C-407E-A947-70E740481C1C}">
-                        <a14:useLocalDpi xmlns:a14="http://schemas.microsoft.com/office/drawing/2010/main" val="0"/>
-                      </a:ext>
-                    </a:extLst>
-                  </a:blip>
-                  <a:srcRect/>
-                  <a:stretch>
-                    <a:fillRect/>
-                  </a:stretch>
-                </pic:blipFill>
-                <pic:spPr bwMode="auto">
-                  <a:xfrm rot="10800000" flipH="1" flipV="1">
-                    <a:off x="0" y="0"/>
-                    <a:ext cx="326004" cy="378092"/>
-                  </a:xfrm>
-                  <a:prstGeom prst="rect">
-                    <a:avLst/>
-                  </a:prstGeom>
-                  <a:noFill/>
-                  <a:ln>
-                    <a:noFill/>
-                  </a:ln>
-                </pic:spPr>
-              </pic:pic>
-            </a:graphicData>
-          </a:graphic>
-        </wp:anchor>
-      </w:drawing>
-    </w:r>
   </w:p>
 </w:hdr>
 </file>
 
 <file path=word/header2.xml><?xml version="1.0" encoding="utf-8"?>
 <w:hdr xmlns:wpc="http://schemas.microsoft.com/office/word/2010/wordprocessingCanvas" xmlns:cx="http://schemas.microsoft.com/office/drawing/2014/chartex" xmlns:cx1="http://schemas.microsoft.com/office/drawing/2015/9/8/chartex" xmlns:cx2="http://schemas.microsoft.com/office/drawing/2015/10/21/chartex" xmlns:cx3="http://schemas.microsoft.com/office/drawing/2016/5/9/chartex" xmlns:cx4="http://schemas.microsoft.com/office/drawing/2016/5/10/chartex" xmlns:cx5="http://schemas.microsoft.com/office/drawing/2016/5/11/chartex" xmlns:cx6="http://schemas.microsoft.com/office/drawing/2016/5/12/chartex" xmlns:cx7="http://schemas.microsoft.com/office/drawing/2016/5/13/chartex" xmlns:cx8="http://schemas.microsoft.com/office/drawing/2016/5/14/chartex" xmlns:mc="http://schemas.openxmlformats.org/markup-compatibility/2006" xmlns:aink="http://schemas.microsoft.com/office/drawing/2016/ink" xmlns:am3d="http://schemas.microsoft.com/office/drawing/2017/model3d" xmlns:o="urn:schemas-microsoft-com:office:office" xmlns:oel="http://schemas.microsoft.com/office/2019/extlst" xmlns:r="http://schemas.openxmlformats.org/officeDocument/2006/relationships" xmlns:m="http://schemas.openxmlformats.org/officeDocument/2006/math" xmlns:v="urn:schemas-microsoft-com:vml" xmlns:wp14="http://schemas.microsoft.com/office/word/2010/wordprocessingDrawing" xmlns:wp="http://schemas.openxmlformats.org/drawingml/2006/wordprocessingDrawing" xmlns:w10="urn:schemas-microsoft-com:office:word" xmlns:w="http://schemas.openxmlformats.org/wordprocessingml/2006/main" xmlns:w14="http://schemas.microsoft.com/office/word/2010/wordml" xmlns:w15="http://schemas.microsoft.com/office/word/2012/wordml" xmlns:w16cex="http://schemas.microsoft.com/office/word/2018/wordml/cex" xmlns:w16cid="http://schemas.microsoft.com/office/word/2016/wordml/cid" xmlns:w16="http://schemas.microsoft.com/office/word/2018/wordml" xmlns:w16du="http://schemas.microsoft.com/office/word/2023/wordml/word16du" xmlns:w16sdtdh="http://schemas.microsoft.com/office/word/2020/wordml/sdtdatahash" xmlns:w16sdtfl="http://schemas.microsoft.com/office/word/2024/wordml/sdtformatlock" xmlns:w16se="http://schemas.microsoft.com/office/word/2015/wordml/symex" xmlns:wpg="http://schemas.microsoft.com/office/word/2010/wordprocessingGroup" xmlns:wpi="http://schemas.microsoft.com/office/word/2010/wordprocessingInk" xmlns:wne="http://schemas.microsoft.com/office/word/2006/wordml" xmlns:wps="http://schemas.microsoft.com/office/word/2010/wordprocessingShape" mc:Ignorable="w14 w15 w16se w16cid w16 w16cex w16sdtdh w16sdtfl w16du wp14">
+  <w:tbl>
+    <w:tblPr>
+      <w:tblStyle w:val="TableGrid"/>
+      <w:tblW w:w="0" w:type="auto"/>
+      <w:tblBorders>
+        <w:top w:val="none" w:sz="0" w:space="0" w:color="auto"/>
+        <w:left w:val="none" w:sz="0" w:space="0" w:color="auto"/>
+        <w:bottom w:val="none" w:sz="0" w:space="0" w:color="auto"/>
+        <w:right w:val="none" w:sz="0" w:space="0" w:color="auto"/>
+        <w:insideH w:val="none" w:sz="0" w:space="0" w:color="auto"/>
+        <w:insideV w:val="none" w:sz="0" w:space="0" w:color="auto"/>
+      </w:tblBorders>
+      <w:tblLook w:val="04A0" w:firstRow="1" w:lastRow="0" w:firstColumn="1" w:lastColumn="0" w:noHBand="0" w:noVBand="1"/>
+    </w:tblPr>
+    <w:tblGrid>
+      <w:gridCol w:w="9811"/>
+      <w:gridCol w:w="729"/>
+    </w:tblGrid>
+    <w:tr>
+      <w:tc>
+        <w:tcPr>
+          <w:tcW w:w="9895" w:type="dxa"/>
+        </w:tcPr>
+        <w:p>
+          <w:pPr>
+            <w:pStyle w:val="Header"/>
+            <w:tabs>
+              <w:tab w:val="clear" w:pos="4419"/>
+              <w:tab w:val="clear" w:pos="8838"/>
+              <w:tab w:val="center" w:pos="4792"/>
+            </w:tabs>
+            <w:rPr>
+              <w:sz w:val="16"/>
+              <w:szCs w:val="16"/>
+            </w:rPr>
+          </w:pPr>
+          <w:r>
+            <w:rPr>
+              <w:sz w:val="16"/>
+              <w:szCs w:val="16"/>
+            </w:rPr>
+            <w:tab/>
+          </w:r>
+        </w:p>
+      </w:tc>
+      <w:tc>
+        <w:tcPr>
+          <w:tcW w:w="635" w:type="dxa"/>
+        </w:tcPr>
+        <w:p>
+          <w:pPr>
+            <w:pStyle w:val="Header"/>
+          </w:pPr>
+          <w:r>
+            <w:rPr>
+              <w:noProof/>
+              <w:sz w:val="16"/>
+              <w:szCs w:val="16"/>
+            </w:rPr>
+            <w:drawing>
+              <wp:inline distT="0" distB="0" distL="0" distR="0" wp14:anchorId="1CD2ED99" wp14:editId="62F1D75A">
+                <wp:extent cx="326004" cy="378092"/>
+                <wp:effectExtent l="0" t="0" r="0" b="3175"/>
+                <wp:docPr id="1378002324" name="Picture 1" descr="The Site Savvy Blog - News, trends, tips, and environmental knowledge."/>
+                <wp:cNvGraphicFramePr>
+                  <a:graphicFrameLocks xmlns:a="http://schemas.openxmlformats.org/drawingml/2006/main" noChangeAspect="1"/>
+                </wp:cNvGraphicFramePr>
+                <a:graphic xmlns:a="http://schemas.openxmlformats.org/drawingml/2006/main">
+                  <a:graphicData uri="http://schemas.openxmlformats.org/drawingml/2006/picture">
+                    <pic:pic xmlns:pic="http://schemas.openxmlformats.org/drawingml/2006/picture">
+                      <pic:nvPicPr>
+                        <pic:cNvPr id="0" name="Picture 1" descr="The Site Savvy Blog - News, trends, tips, and environmental knowledge."/>
+                        <pic:cNvPicPr>
+                          <a:picLocks noChangeAspect="1" noChangeArrowheads="1"/>
+                        </pic:cNvPicPr>
+                      </pic:nvPicPr>
+                      <pic:blipFill>
+                        <a:blip r:embed="rId1">
+                          <a:extLst>
+                            <a:ext uri="{28A0092B-C50C-407E-A947-70E740481C1C}">
+                              <a14:useLocalDpi xmlns:a14="http://schemas.microsoft.com/office/drawing/2010/main" val="0"/>
+                            </a:ext>
+                          </a:extLst>
+                        </a:blip>
+                        <a:srcRect/>
+                        <a:stretch>
+                          <a:fillRect/>
+                        </a:stretch>
+                      </pic:blipFill>
+                      <pic:spPr bwMode="auto">
+                        <a:xfrm rot="10800000" flipH="1" flipV="1">
+                          <a:off x="0" y="0"/>
+                          <a:ext cx="326004" cy="378092"/>
+                        </a:xfrm>
+                        <a:prstGeom prst="rect">
+                          <a:avLst/>
+                        </a:prstGeom>
+                        <a:noFill/>
+                        <a:ln>
+                          <a:noFill/>
+                        </a:ln>
+                      </pic:spPr>
+                    </pic:pic>
+                  </a:graphicData>
+                </a:graphic>
+              </wp:inline>
+            </w:drawing>
+          </w:r>
+        </w:p>
+      </w:tc>
+    </w:tr>
+  </w:tbl>
   <w:p>
     <w:pPr>
       <w:pStyle w:val="Header"/>
@@ -5616,78 +5821,6 @@
         <w:szCs w:val="16"/>
       </w:rPr>
     </w:pPr>
-    <w:r>
-      <w:rPr>
-        <w:noProof/>
-        <w:sz w:val="16"/>
-        <w:szCs w:val="16"/>
-      </w:rPr>
-      <w:drawing>
-        <wp:anchor distT="0" distB="0" distL="114300" distR="114300" simplePos="0" relativeHeight="251666432" behindDoc="0" locked="0" layoutInCell="1" allowOverlap="1" wp14:anchorId="62AB6B39" wp14:editId="301D2F97">
-          <wp:simplePos x="0" y="0"/>
-          <wp:positionH relativeFrom="margin">
-            <wp:align>right</wp:align>
-          </wp:positionH>
-          <wp:positionV relativeFrom="paragraph">
-            <wp:posOffset>-29210</wp:posOffset>
-          </wp:positionV>
-          <wp:extent cx="326004" cy="378092"/>
-          <wp:effectExtent l="0" t="0" r="0" b="3175"/>
-          <wp:wrapThrough wrapText="bothSides">
-            <wp:wrapPolygon edited="0">
-              <wp:start x="21600" y="21600"/>
-              <wp:lineTo x="21600" y="908"/>
-              <wp:lineTo x="1389" y="908"/>
-              <wp:lineTo x="1389" y="18333"/>
-              <wp:lineTo x="2653" y="21600"/>
-              <wp:lineTo x="21600" y="21600"/>
-            </wp:wrapPolygon>
-          </wp:wrapThrough>
-          <wp:docPr id="1166447022" name="Picture 1" descr="The Site Savvy Blog - News, trends, tips, and environmental knowledge."/>
-          <wp:cNvGraphicFramePr>
-            <a:graphicFrameLocks xmlns:a="http://schemas.openxmlformats.org/drawingml/2006/main" noChangeAspect="1"/>
-          </wp:cNvGraphicFramePr>
-          <a:graphic xmlns:a="http://schemas.openxmlformats.org/drawingml/2006/main">
-            <a:graphicData uri="http://schemas.openxmlformats.org/drawingml/2006/picture">
-              <pic:pic xmlns:pic="http://schemas.openxmlformats.org/drawingml/2006/picture">
-                <pic:nvPicPr>
-                  <pic:cNvPr id="0" name="Picture 1" descr="The Site Savvy Blog - News, trends, tips, and environmental knowledge."/>
-                  <pic:cNvPicPr>
-                    <a:picLocks noChangeAspect="1" noChangeArrowheads="1"/>
-                  </pic:cNvPicPr>
-                </pic:nvPicPr>
-                <pic:blipFill>
-                  <a:blip r:embed="rId1">
-                    <a:extLst>
-                      <a:ext uri="{28A0092B-C50C-407E-A947-70E740481C1C}">
-                        <a14:useLocalDpi xmlns:a14="http://schemas.microsoft.com/office/drawing/2010/main" val="0"/>
-                      </a:ext>
-                    </a:extLst>
-                  </a:blip>
-                  <a:srcRect/>
-                  <a:stretch>
-                    <a:fillRect/>
-                  </a:stretch>
-                </pic:blipFill>
-                <pic:spPr bwMode="auto">
-                  <a:xfrm rot="10800000" flipH="1" flipV="1">
-                    <a:off x="0" y="0"/>
-                    <a:ext cx="326004" cy="378092"/>
-                  </a:xfrm>
-                  <a:prstGeom prst="rect">
-                    <a:avLst/>
-                  </a:prstGeom>
-                  <a:noFill/>
-                  <a:ln>
-                    <a:noFill/>
-                  </a:ln>
-                </pic:spPr>
-              </pic:pic>
-            </a:graphicData>
-          </a:graphic>
-        </wp:anchor>
-      </w:drawing>
-    </w:r>
   </w:p>
 </w:hdr>
 </file>
@@ -5697,340 +5830,538 @@
   <w:p>
     <w:pPr>
       <w:pStyle w:val="Header"/>
-      <w:rPr>
-        <w:sz w:val="16"/>
-        <w:szCs w:val="16"/>
-      </w:rPr>
     </w:pPr>
-    <w:r>
-      <w:rPr>
-        <w:noProof/>
-        <w:sz w:val="16"/>
-        <w:szCs w:val="16"/>
-      </w:rPr>
-      <w:drawing>
-        <wp:anchor distT="0" distB="0" distL="114300" distR="114300" simplePos="0" relativeHeight="251675648" behindDoc="0" locked="0" layoutInCell="1" allowOverlap="1" wp14:anchorId="3FE753E3" wp14:editId="44FAF25E">
-          <wp:simplePos x="0" y="0"/>
-          <wp:positionH relativeFrom="margin">
-            <wp:align>right</wp:align>
-          </wp:positionH>
-          <wp:positionV relativeFrom="paragraph">
-            <wp:posOffset>8890</wp:posOffset>
-          </wp:positionV>
-          <wp:extent cx="326004" cy="378092"/>
-          <wp:effectExtent l="0" t="0" r="0" b="3175"/>
-          <wp:wrapThrough wrapText="bothSides">
-            <wp:wrapPolygon edited="0">
-              <wp:start x="21600" y="21600"/>
-              <wp:lineTo x="21600" y="908"/>
-              <wp:lineTo x="1389" y="908"/>
-              <wp:lineTo x="1389" y="18333"/>
-              <wp:lineTo x="2653" y="21600"/>
-              <wp:lineTo x="21600" y="21600"/>
-            </wp:wrapPolygon>
-          </wp:wrapThrough>
-          <wp:docPr id="1896938503" name="Picture 1" descr="The Site Savvy Blog - News, trends, tips, and environmental knowledge."/>
-          <wp:cNvGraphicFramePr>
-            <a:graphicFrameLocks xmlns:a="http://schemas.openxmlformats.org/drawingml/2006/main" noChangeAspect="1"/>
-          </wp:cNvGraphicFramePr>
-          <a:graphic xmlns:a="http://schemas.openxmlformats.org/drawingml/2006/main">
-            <a:graphicData uri="http://schemas.openxmlformats.org/drawingml/2006/picture">
-              <pic:pic xmlns:pic="http://schemas.openxmlformats.org/drawingml/2006/picture">
-                <pic:nvPicPr>
-                  <pic:cNvPr id="0" name="Picture 1" descr="The Site Savvy Blog - News, trends, tips, and environmental knowledge."/>
-                  <pic:cNvPicPr>
-                    <a:picLocks noChangeAspect="1" noChangeArrowheads="1"/>
-                  </pic:cNvPicPr>
-                </pic:nvPicPr>
-                <pic:blipFill>
-                  <a:blip r:embed="rId1">
-                    <a:extLst>
-                      <a:ext uri="{28A0092B-C50C-407E-A947-70E740481C1C}">
-                        <a14:useLocalDpi xmlns:a14="http://schemas.microsoft.com/office/drawing/2010/main" val="0"/>
-                      </a:ext>
-                    </a:extLst>
-                  </a:blip>
-                  <a:srcRect/>
-                  <a:stretch>
-                    <a:fillRect/>
-                  </a:stretch>
-                </pic:blipFill>
-                <pic:spPr bwMode="auto">
-                  <a:xfrm rot="10800000" flipH="1" flipV="1">
-                    <a:off x="0" y="0"/>
-                    <a:ext cx="326004" cy="378092"/>
-                  </a:xfrm>
-                  <a:prstGeom prst="rect">
-                    <a:avLst/>
-                  </a:prstGeom>
-                  <a:noFill/>
-                  <a:ln>
-                    <a:noFill/>
-                  </a:ln>
-                </pic:spPr>
-              </pic:pic>
-            </a:graphicData>
-          </a:graphic>
-        </wp:anchor>
-      </w:drawing>
-    </w:r>
-    <w:r>
-      <w:rPr>
-        <w:sz w:val="16"/>
-        <w:szCs w:val="16"/>
-      </w:rPr>
-      <w:t>POLICY</w:t>
-    </w:r>
-    <w:r>
-      <w:rPr>
-        <w:sz w:val="16"/>
-        <w:szCs w:val="16"/>
-      </w:rPr>
-      <w:t xml:space="preserve"> –</w:t>
-    </w:r>
-    <w:r>
-      <w:rPr>
-        <w:sz w:val="16"/>
-        <w:szCs w:val="16"/>
-      </w:rPr>
-      <w:t xml:space="preserve"> </w:t>
-    </w:r>
-    <w:r>
-      <w:rPr>
-        <w:sz w:val="16"/>
-        <w:szCs w:val="16"/>
-      </w:rPr>
-      <w:t>DevSec CI CD Hardening Policy</w:t>
-    </w:r>
   </w:p>
 </w:hdr>
 </file>
 
 <file path=word/header4.xml><?xml version="1.0" encoding="utf-8"?>
 <w:hdr xmlns:wpc="http://schemas.microsoft.com/office/word/2010/wordprocessingCanvas" xmlns:cx="http://schemas.microsoft.com/office/drawing/2014/chartex" xmlns:cx1="http://schemas.microsoft.com/office/drawing/2015/9/8/chartex" xmlns:cx2="http://schemas.microsoft.com/office/drawing/2015/10/21/chartex" xmlns:cx3="http://schemas.microsoft.com/office/drawing/2016/5/9/chartex" xmlns:cx4="http://schemas.microsoft.com/office/drawing/2016/5/10/chartex" xmlns:cx5="http://schemas.microsoft.com/office/drawing/2016/5/11/chartex" xmlns:cx6="http://schemas.microsoft.com/office/drawing/2016/5/12/chartex" xmlns:cx7="http://schemas.microsoft.com/office/drawing/2016/5/13/chartex" xmlns:cx8="http://schemas.microsoft.com/office/drawing/2016/5/14/chartex" xmlns:mc="http://schemas.openxmlformats.org/markup-compatibility/2006" xmlns:aink="http://schemas.microsoft.com/office/drawing/2016/ink" xmlns:am3d="http://schemas.microsoft.com/office/drawing/2017/model3d" xmlns:o="urn:schemas-microsoft-com:office:office" xmlns:oel="http://schemas.microsoft.com/office/2019/extlst" xmlns:r="http://schemas.openxmlformats.org/officeDocument/2006/relationships" xmlns:m="http://schemas.openxmlformats.org/officeDocument/2006/math" xmlns:v="urn:schemas-microsoft-com:vml" xmlns:wp14="http://schemas.microsoft.com/office/word/2010/wordprocessingDrawing" xmlns:wp="http://schemas.openxmlformats.org/drawingml/2006/wordprocessingDrawing" xmlns:w10="urn:schemas-microsoft-com:office:word" xmlns:w="http://schemas.openxmlformats.org/wordprocessingml/2006/main" xmlns:w14="http://schemas.microsoft.com/office/word/2010/wordml" xmlns:w15="http://schemas.microsoft.com/office/word/2012/wordml" xmlns:w16cex="http://schemas.microsoft.com/office/word/2018/wordml/cex" xmlns:w16cid="http://schemas.microsoft.com/office/word/2016/wordml/cid" xmlns:w16="http://schemas.microsoft.com/office/word/2018/wordml" xmlns:w16du="http://schemas.microsoft.com/office/word/2023/wordml/word16du" xmlns:w16sdtdh="http://schemas.microsoft.com/office/word/2020/wordml/sdtdatahash" xmlns:w16sdtfl="http://schemas.microsoft.com/office/word/2024/wordml/sdtformatlock" xmlns:w16se="http://schemas.microsoft.com/office/word/2015/wordml/symex" xmlns:wpg="http://schemas.microsoft.com/office/word/2010/wordprocessingGroup" xmlns:wpi="http://schemas.microsoft.com/office/word/2010/wordprocessingInk" xmlns:wne="http://schemas.microsoft.com/office/word/2006/wordml" xmlns:wps="http://schemas.microsoft.com/office/word/2010/wordprocessingShape" mc:Ignorable="w14 w15 w16se w16cid w16 w16cex w16sdtdh w16sdtfl w16du wp14">
+  <w:tbl>
+    <w:tblPr>
+      <w:tblStyle w:val="TableGrid"/>
+      <w:tblW w:w="0" w:type="auto"/>
+      <w:tblBorders>
+        <w:top w:val="none" w:sz="0" w:space="0" w:color="auto"/>
+        <w:left w:val="none" w:sz="0" w:space="0" w:color="auto"/>
+        <w:bottom w:val="none" w:sz="0" w:space="0" w:color="auto"/>
+        <w:right w:val="none" w:sz="0" w:space="0" w:color="auto"/>
+        <w:insideH w:val="none" w:sz="0" w:space="0" w:color="auto"/>
+        <w:insideV w:val="none" w:sz="0" w:space="0" w:color="auto"/>
+      </w:tblBorders>
+      <w:tblLook w:val="04A0" w:firstRow="1" w:lastRow="0" w:firstColumn="1" w:lastColumn="0" w:noHBand="0" w:noVBand="1"/>
+    </w:tblPr>
+    <w:tblGrid>
+      <w:gridCol w:w="9811"/>
+      <w:gridCol w:w="729"/>
+    </w:tblGrid>
+    <w:tr>
+      <w:tc>
+        <w:tcPr>
+          <w:tcW w:w="9895" w:type="dxa"/>
+        </w:tcPr>
+        <w:p>
+          <w:pPr>
+            <w:pStyle w:val="Header"/>
+            <w:tabs>
+              <w:tab w:val="clear" w:pos="4419"/>
+              <w:tab w:val="clear" w:pos="8838"/>
+              <w:tab w:val="center" w:pos="4792"/>
+            </w:tabs>
+            <w:rPr>
+              <w:sz w:val="16"/>
+              <w:szCs w:val="16"/>
+            </w:rPr>
+          </w:pPr>
+          <w:r>
+            <w:rPr>
+              <w:sz w:val="16"/>
+              <w:szCs w:val="16"/>
+            </w:rPr>
+            <w:tab/>
+          </w:r>
+        </w:p>
+      </w:tc>
+      <w:tc>
+        <w:tcPr>
+          <w:tcW w:w="635" w:type="dxa"/>
+        </w:tcPr>
+        <w:p>
+          <w:pPr>
+            <w:pStyle w:val="Header"/>
+          </w:pPr>
+          <w:r>
+            <w:rPr>
+              <w:noProof/>
+              <w:sz w:val="16"/>
+              <w:szCs w:val="16"/>
+            </w:rPr>
+            <w:drawing>
+              <wp:inline distT="0" distB="0" distL="0" distR="0" wp14:anchorId="5BB94666" wp14:editId="6DCE9384">
+                <wp:extent cx="326004" cy="378092"/>
+                <wp:effectExtent l="0" t="0" r="0" b="3175"/>
+                <wp:docPr id="1334934036" name="Picture 1" descr="The Site Savvy Blog - News, trends, tips, and environmental knowledge."/>
+                <wp:cNvGraphicFramePr>
+                  <a:graphicFrameLocks xmlns:a="http://schemas.openxmlformats.org/drawingml/2006/main" noChangeAspect="1"/>
+                </wp:cNvGraphicFramePr>
+                <a:graphic xmlns:a="http://schemas.openxmlformats.org/drawingml/2006/main">
+                  <a:graphicData uri="http://schemas.openxmlformats.org/drawingml/2006/picture">
+                    <pic:pic xmlns:pic="http://schemas.openxmlformats.org/drawingml/2006/picture">
+                      <pic:nvPicPr>
+                        <pic:cNvPr id="0" name="Picture 1" descr="The Site Savvy Blog - News, trends, tips, and environmental knowledge."/>
+                        <pic:cNvPicPr>
+                          <a:picLocks noChangeAspect="1" noChangeArrowheads="1"/>
+                        </pic:cNvPicPr>
+                      </pic:nvPicPr>
+                      <pic:blipFill>
+                        <a:blip r:embed="rId1">
+                          <a:extLst>
+                            <a:ext uri="{28A0092B-C50C-407E-A947-70E740481C1C}">
+                              <a14:useLocalDpi xmlns:a14="http://schemas.microsoft.com/office/drawing/2010/main" val="0"/>
+                            </a:ext>
+                          </a:extLst>
+                        </a:blip>
+                        <a:srcRect/>
+                        <a:stretch>
+                          <a:fillRect/>
+                        </a:stretch>
+                      </pic:blipFill>
+                      <pic:spPr bwMode="auto">
+                        <a:xfrm rot="10800000" flipH="1" flipV="1">
+                          <a:off x="0" y="0"/>
+                          <a:ext cx="326004" cy="378092"/>
+                        </a:xfrm>
+                        <a:prstGeom prst="rect">
+                          <a:avLst/>
+                        </a:prstGeom>
+                        <a:noFill/>
+                        <a:ln>
+                          <a:noFill/>
+                        </a:ln>
+                      </pic:spPr>
+                    </pic:pic>
+                  </a:graphicData>
+                </a:graphic>
+              </wp:inline>
+            </w:drawing>
+          </w:r>
+        </w:p>
+      </w:tc>
+    </w:tr>
+  </w:tbl>
   <w:p>
     <w:pPr>
       <w:pStyle w:val="Header"/>
       <w:rPr>
         <w:sz w:val="16"/>
         <w:szCs w:val="16"/>
+        <w:lang w:val="es-CO"/>
       </w:rPr>
     </w:pPr>
-    <w:r>
-      <w:rPr>
-        <w:noProof/>
-        <w:sz w:val="16"/>
-        <w:szCs w:val="16"/>
-      </w:rPr>
-      <w:drawing>
-        <wp:anchor distT="0" distB="0" distL="114300" distR="114300" simplePos="0" relativeHeight="251677696" behindDoc="0" locked="0" layoutInCell="1" allowOverlap="1" wp14:anchorId="3B5852DF" wp14:editId="467018D1">
-          <wp:simplePos x="0" y="0"/>
-          <wp:positionH relativeFrom="margin">
-            <wp:align>right</wp:align>
-          </wp:positionH>
-          <wp:positionV relativeFrom="paragraph">
-            <wp:posOffset>8890</wp:posOffset>
-          </wp:positionV>
-          <wp:extent cx="326004" cy="378092"/>
-          <wp:effectExtent l="0" t="0" r="0" b="3175"/>
-          <wp:wrapThrough wrapText="bothSides">
-            <wp:wrapPolygon edited="0">
-              <wp:start x="21600" y="21600"/>
-              <wp:lineTo x="21600" y="908"/>
-              <wp:lineTo x="1389" y="908"/>
-              <wp:lineTo x="1389" y="18333"/>
-              <wp:lineTo x="2653" y="21600"/>
-              <wp:lineTo x="21600" y="21600"/>
-            </wp:wrapPolygon>
-          </wp:wrapThrough>
-          <wp:docPr id="1165584728" name="Picture 1" descr="The Site Savvy Blog - News, trends, tips, and environmental knowledge."/>
-          <wp:cNvGraphicFramePr>
-            <a:graphicFrameLocks xmlns:a="http://schemas.openxmlformats.org/drawingml/2006/main" noChangeAspect="1"/>
-          </wp:cNvGraphicFramePr>
-          <a:graphic xmlns:a="http://schemas.openxmlformats.org/drawingml/2006/main">
-            <a:graphicData uri="http://schemas.openxmlformats.org/drawingml/2006/picture">
-              <pic:pic xmlns:pic="http://schemas.openxmlformats.org/drawingml/2006/picture">
-                <pic:nvPicPr>
-                  <pic:cNvPr id="0" name="Picture 1" descr="The Site Savvy Blog - News, trends, tips, and environmental knowledge."/>
-                  <pic:cNvPicPr>
-                    <a:picLocks noChangeAspect="1" noChangeArrowheads="1"/>
-                  </pic:cNvPicPr>
-                </pic:nvPicPr>
-                <pic:blipFill>
-                  <a:blip r:embed="rId1">
-                    <a:extLst>
-                      <a:ext uri="{28A0092B-C50C-407E-A947-70E740481C1C}">
-                        <a14:useLocalDpi xmlns:a14="http://schemas.microsoft.com/office/drawing/2010/main" val="0"/>
-                      </a:ext>
-                    </a:extLst>
-                  </a:blip>
-                  <a:srcRect/>
-                  <a:stretch>
-                    <a:fillRect/>
-                  </a:stretch>
-                </pic:blipFill>
-                <pic:spPr bwMode="auto">
-                  <a:xfrm rot="10800000" flipH="1" flipV="1">
-                    <a:off x="0" y="0"/>
-                    <a:ext cx="326004" cy="378092"/>
-                  </a:xfrm>
-                  <a:prstGeom prst="rect">
-                    <a:avLst/>
-                  </a:prstGeom>
-                  <a:noFill/>
-                  <a:ln>
-                    <a:noFill/>
-                  </a:ln>
-                </pic:spPr>
-              </pic:pic>
-            </a:graphicData>
-          </a:graphic>
-        </wp:anchor>
-      </w:drawing>
-    </w:r>
-    <w:r>
-      <w:rPr>
-        <w:sz w:val="16"/>
-        <w:szCs w:val="16"/>
-      </w:rPr>
-      <w:t>POLICY –</w:t>
-    </w:r>
-    <w:r>
-      <w:rPr>
-        <w:sz w:val="16"/>
-        <w:szCs w:val="16"/>
-      </w:rPr>
-      <w:t xml:space="preserve"> </w:t>
-    </w:r>
-    <w:r>
-      <w:rPr>
-        <w:sz w:val="16"/>
-        <w:szCs w:val="16"/>
-      </w:rPr>
-      <w:t>DevSec CI CD Hardening Policy</w:t>
-    </w:r>
   </w:p>
 </w:hdr>
 </file>
 
 <file path=word/header5.xml><?xml version="1.0" encoding="utf-8"?>
 <w:hdr xmlns:wpc="http://schemas.microsoft.com/office/word/2010/wordprocessingCanvas" xmlns:cx="http://schemas.microsoft.com/office/drawing/2014/chartex" xmlns:cx1="http://schemas.microsoft.com/office/drawing/2015/9/8/chartex" xmlns:cx2="http://schemas.microsoft.com/office/drawing/2015/10/21/chartex" xmlns:cx3="http://schemas.microsoft.com/office/drawing/2016/5/9/chartex" xmlns:cx4="http://schemas.microsoft.com/office/drawing/2016/5/10/chartex" xmlns:cx5="http://schemas.microsoft.com/office/drawing/2016/5/11/chartex" xmlns:cx6="http://schemas.microsoft.com/office/drawing/2016/5/12/chartex" xmlns:cx7="http://schemas.microsoft.com/office/drawing/2016/5/13/chartex" xmlns:cx8="http://schemas.microsoft.com/office/drawing/2016/5/14/chartex" xmlns:mc="http://schemas.openxmlformats.org/markup-compatibility/2006" xmlns:aink="http://schemas.microsoft.com/office/drawing/2016/ink" xmlns:am3d="http://schemas.microsoft.com/office/drawing/2017/model3d" xmlns:o="urn:schemas-microsoft-com:office:office" xmlns:oel="http://schemas.microsoft.com/office/2019/extlst" xmlns:r="http://schemas.openxmlformats.org/officeDocument/2006/relationships" xmlns:m="http://schemas.openxmlformats.org/officeDocument/2006/math" xmlns:v="urn:schemas-microsoft-com:vml" xmlns:wp14="http://schemas.microsoft.com/office/word/2010/wordprocessingDrawing" xmlns:wp="http://schemas.openxmlformats.org/drawingml/2006/wordprocessingDrawing" xmlns:w10="urn:schemas-microsoft-com:office:word" xmlns:w="http://schemas.openxmlformats.org/wordprocessingml/2006/main" xmlns:w14="http://schemas.microsoft.com/office/word/2010/wordml" xmlns:w15="http://schemas.microsoft.com/office/word/2012/wordml" xmlns:w16cex="http://schemas.microsoft.com/office/word/2018/wordml/cex" xmlns:w16cid="http://schemas.microsoft.com/office/word/2016/wordml/cid" xmlns:w16="http://schemas.microsoft.com/office/word/2018/wordml" xmlns:w16du="http://schemas.microsoft.com/office/word/2023/wordml/word16du" xmlns:w16sdtdh="http://schemas.microsoft.com/office/word/2020/wordml/sdtdatahash" xmlns:w16sdtfl="http://schemas.microsoft.com/office/word/2024/wordml/sdtformatlock" xmlns:w16se="http://schemas.microsoft.com/office/word/2015/wordml/symex" xmlns:wpg="http://schemas.microsoft.com/office/word/2010/wordprocessingGroup" xmlns:wpi="http://schemas.microsoft.com/office/word/2010/wordprocessingInk" xmlns:wne="http://schemas.microsoft.com/office/word/2006/wordml" xmlns:wps="http://schemas.microsoft.com/office/word/2010/wordprocessingShape" mc:Ignorable="w14 w15 w16se w16cid w16 w16cex w16sdtdh w16sdtfl w16du wp14">
+  <w:tbl>
+    <w:tblPr>
+      <w:tblStyle w:val="TableGrid"/>
+      <w:tblW w:w="0" w:type="auto"/>
+      <w:tblBorders>
+        <w:top w:val="none" w:sz="0" w:space="0" w:color="auto"/>
+        <w:left w:val="none" w:sz="0" w:space="0" w:color="auto"/>
+        <w:bottom w:val="none" w:sz="0" w:space="0" w:color="auto"/>
+        <w:right w:val="none" w:sz="0" w:space="0" w:color="auto"/>
+        <w:insideH w:val="none" w:sz="0" w:space="0" w:color="auto"/>
+        <w:insideV w:val="none" w:sz="0" w:space="0" w:color="auto"/>
+      </w:tblBorders>
+      <w:tblLook w:val="04A0" w:firstRow="1" w:lastRow="0" w:firstColumn="1" w:lastColumn="0" w:noHBand="0" w:noVBand="1"/>
+    </w:tblPr>
+    <w:tblGrid>
+      <w:gridCol w:w="9811"/>
+      <w:gridCol w:w="729"/>
+    </w:tblGrid>
+    <w:tr>
+      <w:tc>
+        <w:tcPr>
+          <w:tcW w:w="9895" w:type="dxa"/>
+        </w:tcPr>
+        <w:p>
+          <w:pPr>
+            <w:pStyle w:val="Header"/>
+            <w:tabs>
+              <w:tab w:val="clear" w:pos="4419"/>
+              <w:tab w:val="clear" w:pos="8838"/>
+              <w:tab w:val="center" w:pos="4792"/>
+            </w:tabs>
+            <w:rPr>
+              <w:sz w:val="16"/>
+              <w:szCs w:val="16"/>
+            </w:rPr>
+          </w:pPr>
+          <w:r>
+            <w:rPr>
+              <w:sz w:val="16"/>
+              <w:szCs w:val="16"/>
+            </w:rPr>
+            <w:t xml:space="preserve">POLICY – </w:t>
+          </w:r>
+          <w:r>
+            <w:rPr>
+              <w:sz w:val="16"/>
+              <w:szCs w:val="16"/>
+            </w:rPr>
+            <w:t>Requirements</w:t>
+          </w:r>
+          <w:r>
+            <w:rPr>
+              <w:sz w:val="16"/>
+              <w:szCs w:val="16"/>
+            </w:rPr>
+            <w:tab/>
+          </w:r>
+        </w:p>
+      </w:tc>
+      <w:tc>
+        <w:tcPr>
+          <w:tcW w:w="635" w:type="dxa"/>
+        </w:tcPr>
+        <w:p>
+          <w:pPr>
+            <w:pStyle w:val="Header"/>
+          </w:pPr>
+          <w:r>
+            <w:rPr>
+              <w:noProof/>
+              <w:sz w:val="16"/>
+              <w:szCs w:val="16"/>
+            </w:rPr>
+            <w:drawing>
+              <wp:inline distT="0" distB="0" distL="0" distR="0" wp14:anchorId="78452E9E" wp14:editId="111A4EB3">
+                <wp:extent cx="326004" cy="378092"/>
+                <wp:effectExtent l="0" t="0" r="0" b="3175"/>
+                <wp:docPr id="1716471675" name="Picture 1" descr="The Site Savvy Blog - News, trends, tips, and environmental knowledge."/>
+                <wp:cNvGraphicFramePr>
+                  <a:graphicFrameLocks xmlns:a="http://schemas.openxmlformats.org/drawingml/2006/main" noChangeAspect="1"/>
+                </wp:cNvGraphicFramePr>
+                <a:graphic xmlns:a="http://schemas.openxmlformats.org/drawingml/2006/main">
+                  <a:graphicData uri="http://schemas.openxmlformats.org/drawingml/2006/picture">
+                    <pic:pic xmlns:pic="http://schemas.openxmlformats.org/drawingml/2006/picture">
+                      <pic:nvPicPr>
+                        <pic:cNvPr id="0" name="Picture 1" descr="The Site Savvy Blog - News, trends, tips, and environmental knowledge."/>
+                        <pic:cNvPicPr>
+                          <a:picLocks noChangeAspect="1" noChangeArrowheads="1"/>
+                        </pic:cNvPicPr>
+                      </pic:nvPicPr>
+                      <pic:blipFill>
+                        <a:blip r:embed="rId1">
+                          <a:extLst>
+                            <a:ext uri="{28A0092B-C50C-407E-A947-70E740481C1C}">
+                              <a14:useLocalDpi xmlns:a14="http://schemas.microsoft.com/office/drawing/2010/main" val="0"/>
+                            </a:ext>
+                          </a:extLst>
+                        </a:blip>
+                        <a:srcRect/>
+                        <a:stretch>
+                          <a:fillRect/>
+                        </a:stretch>
+                      </pic:blipFill>
+                      <pic:spPr bwMode="auto">
+                        <a:xfrm rot="10800000" flipH="1" flipV="1">
+                          <a:off x="0" y="0"/>
+                          <a:ext cx="326004" cy="378092"/>
+                        </a:xfrm>
+                        <a:prstGeom prst="rect">
+                          <a:avLst/>
+                        </a:prstGeom>
+                        <a:noFill/>
+                        <a:ln>
+                          <a:noFill/>
+                        </a:ln>
+                      </pic:spPr>
+                    </pic:pic>
+                  </a:graphicData>
+                </a:graphic>
+              </wp:inline>
+            </w:drawing>
+          </w:r>
+        </w:p>
+      </w:tc>
+    </w:tr>
+  </w:tbl>
   <w:p>
     <w:pPr>
       <w:pStyle w:val="Header"/>
-      <w:rPr>
-        <w:sz w:val="16"/>
-        <w:szCs w:val="16"/>
-      </w:rPr>
     </w:pPr>
-    <w:r>
-      <w:rPr>
-        <w:noProof/>
-        <w:sz w:val="16"/>
-        <w:szCs w:val="16"/>
-      </w:rPr>
-      <w:drawing>
-        <wp:anchor distT="0" distB="0" distL="114300" distR="114300" simplePos="0" relativeHeight="251669504" behindDoc="0" locked="0" layoutInCell="1" allowOverlap="1" wp14:anchorId="71DE6B8B" wp14:editId="5751FE76">
-          <wp:simplePos x="0" y="0"/>
-          <wp:positionH relativeFrom="margin">
-            <wp:align>right</wp:align>
-          </wp:positionH>
-          <wp:positionV relativeFrom="paragraph">
-            <wp:posOffset>8890</wp:posOffset>
-          </wp:positionV>
-          <wp:extent cx="326004" cy="378092"/>
-          <wp:effectExtent l="0" t="0" r="0" b="3175"/>
-          <wp:wrapThrough wrapText="bothSides">
-            <wp:wrapPolygon edited="0">
-              <wp:start x="21600" y="21600"/>
-              <wp:lineTo x="21600" y="908"/>
-              <wp:lineTo x="1389" y="908"/>
-              <wp:lineTo x="1389" y="18333"/>
-              <wp:lineTo x="2653" y="21600"/>
-              <wp:lineTo x="21600" y="21600"/>
-            </wp:wrapPolygon>
-          </wp:wrapThrough>
-          <wp:docPr id="739307350" name="Picture 1" descr="The Site Savvy Blog - News, trends, tips, and environmental knowledge."/>
-          <wp:cNvGraphicFramePr>
-            <a:graphicFrameLocks xmlns:a="http://schemas.openxmlformats.org/drawingml/2006/main" noChangeAspect="1"/>
-          </wp:cNvGraphicFramePr>
-          <a:graphic xmlns:a="http://schemas.openxmlformats.org/drawingml/2006/main">
-            <a:graphicData uri="http://schemas.openxmlformats.org/drawingml/2006/picture">
-              <pic:pic xmlns:pic="http://schemas.openxmlformats.org/drawingml/2006/picture">
-                <pic:nvPicPr>
-                  <pic:cNvPr id="0" name="Picture 1" descr="The Site Savvy Blog - News, trends, tips, and environmental knowledge."/>
-                  <pic:cNvPicPr>
-                    <a:picLocks noChangeAspect="1" noChangeArrowheads="1"/>
-                  </pic:cNvPicPr>
-                </pic:nvPicPr>
-                <pic:blipFill>
-                  <a:blip r:embed="rId1">
-                    <a:extLst>
-                      <a:ext uri="{28A0092B-C50C-407E-A947-70E740481C1C}">
-                        <a14:useLocalDpi xmlns:a14="http://schemas.microsoft.com/office/drawing/2010/main" val="0"/>
-                      </a:ext>
-                    </a:extLst>
-                  </a:blip>
-                  <a:srcRect/>
-                  <a:stretch>
-                    <a:fillRect/>
-                  </a:stretch>
-                </pic:blipFill>
-                <pic:spPr bwMode="auto">
-                  <a:xfrm rot="10800000" flipH="1" flipV="1">
-                    <a:off x="0" y="0"/>
-                    <a:ext cx="326004" cy="378092"/>
-                  </a:xfrm>
-                  <a:prstGeom prst="rect">
-                    <a:avLst/>
-                  </a:prstGeom>
-                  <a:noFill/>
-                  <a:ln>
-                    <a:noFill/>
-                  </a:ln>
-                </pic:spPr>
-              </pic:pic>
-            </a:graphicData>
-          </a:graphic>
-        </wp:anchor>
-      </w:drawing>
-    </w:r>
-    <w:r>
-      <w:rPr>
-        <w:sz w:val="16"/>
-        <w:szCs w:val="16"/>
-      </w:rPr>
-      <w:t>POLICY</w:t>
-    </w:r>
-    <w:r>
-      <w:rPr>
-        <w:sz w:val="16"/>
-        <w:szCs w:val="16"/>
-      </w:rPr>
-      <w:t xml:space="preserve"> </w:t>
-    </w:r>
-    <w:r>
-      <w:rPr>
-        <w:sz w:val="16"/>
-        <w:szCs w:val="16"/>
-      </w:rPr>
-      <w:t>–</w:t>
-    </w:r>
-    <w:r>
-      <w:rPr>
-        <w:sz w:val="16"/>
-        <w:szCs w:val="16"/>
-      </w:rPr>
-      <w:t xml:space="preserve"> </w:t>
-    </w:r>
-    <w:r>
-      <w:rPr>
-        <w:sz w:val="16"/>
-        <w:szCs w:val="16"/>
-      </w:rPr>
-      <w:t>Approval Signatures</w:t>
-    </w:r>
   </w:p>
+</w:hdr>
+</file>
+
+<file path=word/header6.xml><?xml version="1.0" encoding="utf-8"?>
+<w:hdr xmlns:wpc="http://schemas.microsoft.com/office/word/2010/wordprocessingCanvas" xmlns:cx="http://schemas.microsoft.com/office/drawing/2014/chartex" xmlns:cx1="http://schemas.microsoft.com/office/drawing/2015/9/8/chartex" xmlns:cx2="http://schemas.microsoft.com/office/drawing/2015/10/21/chartex" xmlns:cx3="http://schemas.microsoft.com/office/drawing/2016/5/9/chartex" xmlns:cx4="http://schemas.microsoft.com/office/drawing/2016/5/10/chartex" xmlns:cx5="http://schemas.microsoft.com/office/drawing/2016/5/11/chartex" xmlns:cx6="http://schemas.microsoft.com/office/drawing/2016/5/12/chartex" xmlns:cx7="http://schemas.microsoft.com/office/drawing/2016/5/13/chartex" xmlns:cx8="http://schemas.microsoft.com/office/drawing/2016/5/14/chartex" xmlns:mc="http://schemas.openxmlformats.org/markup-compatibility/2006" xmlns:aink="http://schemas.microsoft.com/office/drawing/2016/ink" xmlns:am3d="http://schemas.microsoft.com/office/drawing/2017/model3d" xmlns:o="urn:schemas-microsoft-com:office:office" xmlns:oel="http://schemas.microsoft.com/office/2019/extlst" xmlns:r="http://schemas.openxmlformats.org/officeDocument/2006/relationships" xmlns:m="http://schemas.openxmlformats.org/officeDocument/2006/math" xmlns:v="urn:schemas-microsoft-com:vml" xmlns:wp14="http://schemas.microsoft.com/office/word/2010/wordprocessingDrawing" xmlns:wp="http://schemas.openxmlformats.org/drawingml/2006/wordprocessingDrawing" xmlns:w10="urn:schemas-microsoft-com:office:word" xmlns:w="http://schemas.openxmlformats.org/wordprocessingml/2006/main" xmlns:w14="http://schemas.microsoft.com/office/word/2010/wordml" xmlns:w15="http://schemas.microsoft.com/office/word/2012/wordml" xmlns:w16cex="http://schemas.microsoft.com/office/word/2018/wordml/cex" xmlns:w16cid="http://schemas.microsoft.com/office/word/2016/wordml/cid" xmlns:w16="http://schemas.microsoft.com/office/word/2018/wordml" xmlns:w16du="http://schemas.microsoft.com/office/word/2023/wordml/word16du" xmlns:w16sdtdh="http://schemas.microsoft.com/office/word/2020/wordml/sdtdatahash" xmlns:w16sdtfl="http://schemas.microsoft.com/office/word/2024/wordml/sdtformatlock" xmlns:w16se="http://schemas.microsoft.com/office/word/2015/wordml/symex" xmlns:wpg="http://schemas.microsoft.com/office/word/2010/wordprocessingGroup" xmlns:wpi="http://schemas.microsoft.com/office/word/2010/wordprocessingInk" xmlns:wne="http://schemas.microsoft.com/office/word/2006/wordml" xmlns:wps="http://schemas.microsoft.com/office/word/2010/wordprocessingShape" mc:Ignorable="w14 w15 w16se w16cid w16 w16cex w16sdtdh w16sdtfl w16du wp14">
+  <w:tbl>
+    <w:tblPr>
+      <w:tblStyle w:val="TableGrid"/>
+      <w:tblW w:w="0" w:type="auto"/>
+      <w:tblBorders>
+        <w:top w:val="none" w:sz="0" w:space="0" w:color="auto"/>
+        <w:left w:val="none" w:sz="0" w:space="0" w:color="auto"/>
+        <w:bottom w:val="none" w:sz="0" w:space="0" w:color="auto"/>
+        <w:right w:val="none" w:sz="0" w:space="0" w:color="auto"/>
+        <w:insideH w:val="none" w:sz="0" w:space="0" w:color="auto"/>
+        <w:insideV w:val="none" w:sz="0" w:space="0" w:color="auto"/>
+      </w:tblBorders>
+      <w:tblLook w:val="04A0" w:firstRow="1" w:lastRow="0" w:firstColumn="1" w:lastColumn="0" w:noHBand="0" w:noVBand="1"/>
+    </w:tblPr>
+    <w:tblGrid>
+      <w:gridCol w:w="9811"/>
+      <w:gridCol w:w="729"/>
+    </w:tblGrid>
+    <w:tr>
+      <w:tc>
+        <w:tcPr>
+          <w:tcW w:w="9895" w:type="dxa"/>
+        </w:tcPr>
+        <w:p>
+          <w:pPr>
+            <w:pStyle w:val="Header"/>
+            <w:tabs>
+              <w:tab w:val="clear" w:pos="4419"/>
+              <w:tab w:val="clear" w:pos="8838"/>
+              <w:tab w:val="center" w:pos="4792"/>
+            </w:tabs>
+            <w:rPr>
+              <w:sz w:val="16"/>
+              <w:szCs w:val="16"/>
+            </w:rPr>
+          </w:pPr>
+          <w:r>
+            <w:rPr>
+              <w:sz w:val="16"/>
+              <w:szCs w:val="16"/>
+            </w:rPr>
+            <w:t xml:space="preserve">POLICY – </w:t>
+          </w:r>
+          <w:r>
+            <w:rPr>
+              <w:sz w:val="16"/>
+              <w:szCs w:val="16"/>
+            </w:rPr>
+            <w:t>Violations</w:t>
+          </w:r>
+          <w:r>
+            <w:rPr>
+              <w:sz w:val="16"/>
+              <w:szCs w:val="16"/>
+            </w:rPr>
+            <w:tab/>
+          </w:r>
+        </w:p>
+      </w:tc>
+      <w:tc>
+        <w:tcPr>
+          <w:tcW w:w="635" w:type="dxa"/>
+        </w:tcPr>
+        <w:p>
+          <w:pPr>
+            <w:pStyle w:val="Header"/>
+          </w:pPr>
+          <w:r>
+            <w:rPr>
+              <w:noProof/>
+              <w:sz w:val="16"/>
+              <w:szCs w:val="16"/>
+            </w:rPr>
+            <w:drawing>
+              <wp:inline distT="0" distB="0" distL="0" distR="0" wp14:anchorId="280FC34E" wp14:editId="7FC450FD">
+                <wp:extent cx="326004" cy="378092"/>
+                <wp:effectExtent l="0" t="0" r="0" b="3175"/>
+                <wp:docPr id="1034487023" name="Picture 1" descr="The Site Savvy Blog - News, trends, tips, and environmental knowledge."/>
+                <wp:cNvGraphicFramePr>
+                  <a:graphicFrameLocks xmlns:a="http://schemas.openxmlformats.org/drawingml/2006/main" noChangeAspect="1"/>
+                </wp:cNvGraphicFramePr>
+                <a:graphic xmlns:a="http://schemas.openxmlformats.org/drawingml/2006/main">
+                  <a:graphicData uri="http://schemas.openxmlformats.org/drawingml/2006/picture">
+                    <pic:pic xmlns:pic="http://schemas.openxmlformats.org/drawingml/2006/picture">
+                      <pic:nvPicPr>
+                        <pic:cNvPr id="0" name="Picture 1" descr="The Site Savvy Blog - News, trends, tips, and environmental knowledge."/>
+                        <pic:cNvPicPr>
+                          <a:picLocks noChangeAspect="1" noChangeArrowheads="1"/>
+                        </pic:cNvPicPr>
+                      </pic:nvPicPr>
+                      <pic:blipFill>
+                        <a:blip r:embed="rId1">
+                          <a:extLst>
+                            <a:ext uri="{28A0092B-C50C-407E-A947-70E740481C1C}">
+                              <a14:useLocalDpi xmlns:a14="http://schemas.microsoft.com/office/drawing/2010/main" val="0"/>
+                            </a:ext>
+                          </a:extLst>
+                        </a:blip>
+                        <a:srcRect/>
+                        <a:stretch>
+                          <a:fillRect/>
+                        </a:stretch>
+                      </pic:blipFill>
+                      <pic:spPr bwMode="auto">
+                        <a:xfrm rot="10800000" flipH="1" flipV="1">
+                          <a:off x="0" y="0"/>
+                          <a:ext cx="326004" cy="378092"/>
+                        </a:xfrm>
+                        <a:prstGeom prst="rect">
+                          <a:avLst/>
+                        </a:prstGeom>
+                        <a:noFill/>
+                        <a:ln>
+                          <a:noFill/>
+                        </a:ln>
+                      </pic:spPr>
+                    </pic:pic>
+                  </a:graphicData>
+                </a:graphic>
+              </wp:inline>
+            </w:drawing>
+          </w:r>
+        </w:p>
+      </w:tc>
+    </w:tr>
+  </w:tbl>
+  <w:p>
+    <w:pPr>
+      <w:pStyle w:val="Header"/>
+    </w:pPr>
+  </w:p>
+</w:hdr>
+</file>
+
+<file path=word/header7.xml><?xml version="1.0" encoding="utf-8"?>
+<w:hdr xmlns:wpc="http://schemas.microsoft.com/office/word/2010/wordprocessingCanvas" xmlns:cx="http://schemas.microsoft.com/office/drawing/2014/chartex" xmlns:cx1="http://schemas.microsoft.com/office/drawing/2015/9/8/chartex" xmlns:cx2="http://schemas.microsoft.com/office/drawing/2015/10/21/chartex" xmlns:cx3="http://schemas.microsoft.com/office/drawing/2016/5/9/chartex" xmlns:cx4="http://schemas.microsoft.com/office/drawing/2016/5/10/chartex" xmlns:cx5="http://schemas.microsoft.com/office/drawing/2016/5/11/chartex" xmlns:cx6="http://schemas.microsoft.com/office/drawing/2016/5/12/chartex" xmlns:cx7="http://schemas.microsoft.com/office/drawing/2016/5/13/chartex" xmlns:cx8="http://schemas.microsoft.com/office/drawing/2016/5/14/chartex" xmlns:mc="http://schemas.openxmlformats.org/markup-compatibility/2006" xmlns:aink="http://schemas.microsoft.com/office/drawing/2016/ink" xmlns:am3d="http://schemas.microsoft.com/office/drawing/2017/model3d" xmlns:o="urn:schemas-microsoft-com:office:office" xmlns:oel="http://schemas.microsoft.com/office/2019/extlst" xmlns:r="http://schemas.openxmlformats.org/officeDocument/2006/relationships" xmlns:m="http://schemas.openxmlformats.org/officeDocument/2006/math" xmlns:v="urn:schemas-microsoft-com:vml" xmlns:wp14="http://schemas.microsoft.com/office/word/2010/wordprocessingDrawing" xmlns:wp="http://schemas.openxmlformats.org/drawingml/2006/wordprocessingDrawing" xmlns:w10="urn:schemas-microsoft-com:office:word" xmlns:w="http://schemas.openxmlformats.org/wordprocessingml/2006/main" xmlns:w14="http://schemas.microsoft.com/office/word/2010/wordml" xmlns:w15="http://schemas.microsoft.com/office/word/2012/wordml" xmlns:w16cex="http://schemas.microsoft.com/office/word/2018/wordml/cex" xmlns:w16cid="http://schemas.microsoft.com/office/word/2016/wordml/cid" xmlns:w16="http://schemas.microsoft.com/office/word/2018/wordml" xmlns:w16du="http://schemas.microsoft.com/office/word/2023/wordml/word16du" xmlns:w16sdtdh="http://schemas.microsoft.com/office/word/2020/wordml/sdtdatahash" xmlns:w16sdtfl="http://schemas.microsoft.com/office/word/2024/wordml/sdtformatlock" xmlns:w16se="http://schemas.microsoft.com/office/word/2015/wordml/symex" xmlns:wpg="http://schemas.microsoft.com/office/word/2010/wordprocessingGroup" xmlns:wpi="http://schemas.microsoft.com/office/word/2010/wordprocessingInk" xmlns:wne="http://schemas.microsoft.com/office/word/2006/wordml" xmlns:wps="http://schemas.microsoft.com/office/word/2010/wordprocessingShape" mc:Ignorable="w14 w15 w16se w16cid w16 w16cex w16sdtdh w16sdtfl w16du wp14">
+  <w:tbl>
+    <w:tblPr>
+      <w:tblStyle w:val="TableGrid"/>
+      <w:tblW w:w="0" w:type="auto"/>
+      <w:tblBorders>
+        <w:top w:val="none" w:sz="0" w:space="0" w:color="auto"/>
+        <w:left w:val="none" w:sz="0" w:space="0" w:color="auto"/>
+        <w:bottom w:val="none" w:sz="0" w:space="0" w:color="auto"/>
+        <w:right w:val="none" w:sz="0" w:space="0" w:color="auto"/>
+        <w:insideH w:val="none" w:sz="0" w:space="0" w:color="auto"/>
+        <w:insideV w:val="none" w:sz="0" w:space="0" w:color="auto"/>
+      </w:tblBorders>
+      <w:tblLook w:val="04A0" w:firstRow="1" w:lastRow="0" w:firstColumn="1" w:lastColumn="0" w:noHBand="0" w:noVBand="1"/>
+    </w:tblPr>
+    <w:tblGrid>
+      <w:gridCol w:w="9811"/>
+      <w:gridCol w:w="729"/>
+    </w:tblGrid>
+    <w:tr>
+      <w:tc>
+        <w:tcPr>
+          <w:tcW w:w="9895" w:type="dxa"/>
+        </w:tcPr>
+        <w:p>
+          <w:pPr>
+            <w:pStyle w:val="Header"/>
+            <w:tabs>
+              <w:tab w:val="clear" w:pos="4419"/>
+              <w:tab w:val="clear" w:pos="8838"/>
+              <w:tab w:val="center" w:pos="4792"/>
+            </w:tabs>
+            <w:rPr>
+              <w:sz w:val="16"/>
+              <w:szCs w:val="16"/>
+            </w:rPr>
+          </w:pPr>
+          <w:r>
+            <w:rPr>
+              <w:sz w:val="16"/>
+              <w:szCs w:val="16"/>
+            </w:rPr>
+            <w:t xml:space="preserve">POLICY – </w:t>
+          </w:r>
+          <w:r>
+            <w:rPr>
+              <w:sz w:val="16"/>
+              <w:szCs w:val="16"/>
+            </w:rPr>
+            <w:t>Approval Signatures</w:t>
+          </w:r>
+          <w:r>
+            <w:rPr>
+              <w:sz w:val="16"/>
+              <w:szCs w:val="16"/>
+            </w:rPr>
+            <w:tab/>
+          </w:r>
+        </w:p>
+      </w:tc>
+      <w:tc>
+        <w:tcPr>
+          <w:tcW w:w="635" w:type="dxa"/>
+        </w:tcPr>
+        <w:p>
+          <w:pPr>
+            <w:pStyle w:val="Header"/>
+          </w:pPr>
+          <w:r>
+            <w:rPr>
+              <w:noProof/>
+              <w:sz w:val="16"/>
+              <w:szCs w:val="16"/>
+            </w:rPr>
+            <w:drawing>
+              <wp:inline distT="0" distB="0" distL="0" distR="0" wp14:anchorId="062CAB2D" wp14:editId="7AAF8D26">
+                <wp:extent cx="326004" cy="378092"/>
+                <wp:effectExtent l="0" t="0" r="0" b="3175"/>
+                <wp:docPr id="2116958808" name="Picture 1" descr="The Site Savvy Blog - News, trends, tips, and environmental knowledge."/>
+                <wp:cNvGraphicFramePr>
+                  <a:graphicFrameLocks xmlns:a="http://schemas.openxmlformats.org/drawingml/2006/main" noChangeAspect="1"/>
+                </wp:cNvGraphicFramePr>
+                <a:graphic xmlns:a="http://schemas.openxmlformats.org/drawingml/2006/main">
+                  <a:graphicData uri="http://schemas.openxmlformats.org/drawingml/2006/picture">
+                    <pic:pic xmlns:pic="http://schemas.openxmlformats.org/drawingml/2006/picture">
+                      <pic:nvPicPr>
+                        <pic:cNvPr id="0" name="Picture 1" descr="The Site Savvy Blog - News, trends, tips, and environmental knowledge."/>
+                        <pic:cNvPicPr>
+                          <a:picLocks noChangeAspect="1" noChangeArrowheads="1"/>
+                        </pic:cNvPicPr>
+                      </pic:nvPicPr>
+                      <pic:blipFill>
+                        <a:blip r:embed="rId1">
+                          <a:extLst>
+                            <a:ext uri="{28A0092B-C50C-407E-A947-70E740481C1C}">
+                              <a14:useLocalDpi xmlns:a14="http://schemas.microsoft.com/office/drawing/2010/main" val="0"/>
+                            </a:ext>
+                          </a:extLst>
+                        </a:blip>
+                        <a:srcRect/>
+                        <a:stretch>
+                          <a:fillRect/>
+                        </a:stretch>
+                      </pic:blipFill>
+                      <pic:spPr bwMode="auto">
+                        <a:xfrm rot="10800000" flipH="1" flipV="1">
+                          <a:off x="0" y="0"/>
+                          <a:ext cx="326004" cy="378092"/>
+                        </a:xfrm>
+                        <a:prstGeom prst="rect">
+                          <a:avLst/>
+                        </a:prstGeom>
+                        <a:noFill/>
+                        <a:ln>
+                          <a:noFill/>
+                        </a:ln>
+                      </pic:spPr>
+                    </pic:pic>
+                  </a:graphicData>
+                </a:graphic>
+              </wp:inline>
+            </w:drawing>
+          </w:r>
+        </w:p>
+      </w:tc>
+    </w:tr>
+  </w:tbl>
   <w:p>
     <w:pPr>
       <w:pStyle w:val="Header"/>
@@ -8672,7 +9003,7 @@
   <w:style w:type="paragraph" w:default="1" w:styleId="Normal">
     <w:name w:val="Normal"/>
     <w:qFormat/>
-    <w:rsid w:val="00921426"/>
+    <w:rsid w:val="00A371C0"/>
   </w:style>
   <w:style w:type="paragraph" w:styleId="Heading1">
     <w:name w:val="heading 1"/>

</xml_diff>